<commit_message>
Fix program and folio, add Busy Work library
</commit_message>
<xml_diff>
--- a/resources/teacher/Crack-the-Code-10-Week-Teaching-Program.docx
+++ b/resources/teacher/Crack-the-Code-10-Week-Teaching-Program.docx
@@ -43,14 +43,15 @@
     <w:p/>
     <w:tbl>
       <w:tblPr>
-        <w:tblW w:type="auto" w:w="0"/>
-        <w:jc w:val="center"/>
+        <w:tblW w:type="dxa" w:w="13680"/>
         <w:tblLayout w:type="fixed"/>
         <w:tblLook w:firstColumn="1" w:firstRow="1" w:lastColumn="0" w:lastRow="0" w:noHBand="0" w:noVBand="1" w:val="04A0"/>
+        <w:jc w:val="center"/>
+        <w:tblInd w:type="dxa" w:w="120"/>
       </w:tblPr>
       <w:tblGrid>
-        <w:gridCol w:w="2880"/>
-        <w:gridCol w:w="11664"/>
+        <w:gridCol w:w="2709"/>
+        <w:gridCol w:w="10971"/>
       </w:tblGrid>
       <w:tr>
         <w:trPr>
@@ -58,7 +59,7 @@
         </w:trPr>
         <w:tc>
           <w:tcPr>
-            <w:tcW w:type="dxa" w:w="7438"/>
+            <w:tcW w:type="dxa" w:w="2709"/>
             <w:vAlign w:val="center"/>
             <w:tcMar>
               <w:top w:w="80" w:type="dxa"/>
@@ -86,7 +87,7 @@
         </w:tc>
         <w:tc>
           <w:tcPr>
-            <w:tcW w:type="dxa" w:w="7438"/>
+            <w:tcW w:type="dxa" w:w="10971"/>
             <w:vAlign w:val="center"/>
             <w:tcMar>
               <w:top w:w="80" w:type="dxa"/>
@@ -114,9 +115,10 @@
         </w:tc>
       </w:tr>
       <w:tr>
+        <w:trPr/>
         <w:tc>
           <w:tcPr>
-            <w:tcW w:type="dxa" w:w="2880"/>
+            <w:tcW w:type="dxa" w:w="2709"/>
             <w:vAlign w:val="center"/>
             <w:tcMar>
               <w:top w:w="80" w:type="dxa"/>
@@ -143,7 +145,7 @@
         </w:tc>
         <w:tc>
           <w:tcPr>
-            <w:tcW w:type="dxa" w:w="11664"/>
+            <w:tcW w:type="dxa" w:w="10971"/>
             <w:vAlign w:val="center"/>
             <w:tcMar>
               <w:top w:w="80" w:type="dxa"/>
@@ -170,9 +172,10 @@
         </w:tc>
       </w:tr>
       <w:tr>
+        <w:trPr/>
         <w:tc>
           <w:tcPr>
-            <w:tcW w:type="dxa" w:w="2880"/>
+            <w:tcW w:type="dxa" w:w="2709"/>
             <w:vAlign w:val="center"/>
             <w:tcMar>
               <w:top w:w="80" w:type="dxa"/>
@@ -200,7 +203,7 @@
         </w:tc>
         <w:tc>
           <w:tcPr>
-            <w:tcW w:type="dxa" w:w="11664"/>
+            <w:tcW w:type="dxa" w:w="10971"/>
             <w:vAlign w:val="center"/>
             <w:tcMar>
               <w:top w:w="80" w:type="dxa"/>
@@ -228,9 +231,10 @@
         </w:tc>
       </w:tr>
       <w:tr>
+        <w:trPr/>
         <w:tc>
           <w:tcPr>
-            <w:tcW w:type="dxa" w:w="2880"/>
+            <w:tcW w:type="dxa" w:w="2709"/>
             <w:vAlign w:val="center"/>
             <w:tcMar>
               <w:top w:w="80" w:type="dxa"/>
@@ -257,7 +261,7 @@
         </w:tc>
         <w:tc>
           <w:tcPr>
-            <w:tcW w:type="dxa" w:w="11664"/>
+            <w:tcW w:type="dxa" w:w="10971"/>
             <w:vAlign w:val="center"/>
             <w:tcMar>
               <w:top w:w="80" w:type="dxa"/>
@@ -284,9 +288,10 @@
         </w:tc>
       </w:tr>
       <w:tr>
+        <w:trPr/>
         <w:tc>
           <w:tcPr>
-            <w:tcW w:type="dxa" w:w="2880"/>
+            <w:tcW w:type="dxa" w:w="2709"/>
             <w:vAlign w:val="center"/>
             <w:tcMar>
               <w:top w:w="80" w:type="dxa"/>
@@ -314,7 +319,7 @@
         </w:tc>
         <w:tc>
           <w:tcPr>
-            <w:tcW w:type="dxa" w:w="11664"/>
+            <w:tcW w:type="dxa" w:w="10971"/>
             <w:vAlign w:val="center"/>
             <w:tcMar>
               <w:top w:w="80" w:type="dxa"/>
@@ -342,9 +347,10 @@
         </w:tc>
       </w:tr>
       <w:tr>
+        <w:trPr/>
         <w:tc>
           <w:tcPr>
-            <w:tcW w:type="dxa" w:w="2880"/>
+            <w:tcW w:type="dxa" w:w="2709"/>
             <w:vAlign w:val="center"/>
             <w:tcMar>
               <w:top w:w="80" w:type="dxa"/>
@@ -371,7 +377,7 @@
         </w:tc>
         <w:tc>
           <w:tcPr>
-            <w:tcW w:type="dxa" w:w="11664"/>
+            <w:tcW w:type="dxa" w:w="10971"/>
             <w:vAlign w:val="center"/>
             <w:tcMar>
               <w:top w:w="80" w:type="dxa"/>
@@ -398,9 +404,10 @@
         </w:tc>
       </w:tr>
       <w:tr>
+        <w:trPr/>
         <w:tc>
           <w:tcPr>
-            <w:tcW w:type="dxa" w:w="2880"/>
+            <w:tcW w:type="dxa" w:w="2709"/>
             <w:vAlign w:val="center"/>
             <w:tcMar>
               <w:top w:w="80" w:type="dxa"/>
@@ -428,7 +435,7 @@
         </w:tc>
         <w:tc>
           <w:tcPr>
-            <w:tcW w:type="dxa" w:w="11664"/>
+            <w:tcW w:type="dxa" w:w="10971"/>
             <w:vAlign w:val="center"/>
             <w:tcMar>
               <w:top w:w="80" w:type="dxa"/>
@@ -606,15 +613,16 @@
     </w:p>
     <w:tbl>
       <w:tblPr>
-        <w:tblW w:type="auto" w:w="0"/>
-        <w:jc w:val="center"/>
+        <w:tblW w:type="dxa" w:w="13680"/>
         <w:tblLayout w:type="fixed"/>
         <w:tblLook w:firstColumn="1" w:firstRow="1" w:lastColumn="0" w:lastRow="0" w:noHBand="0" w:noVBand="1" w:val="04A0"/>
+        <w:jc w:val="center"/>
+        <w:tblInd w:type="dxa" w:w="120"/>
       </w:tblPr>
       <w:tblGrid>
-        <w:gridCol w:w="1656"/>
-        <w:gridCol w:w="5112"/>
-        <w:gridCol w:w="7776"/>
+        <w:gridCol w:w="1558"/>
+        <w:gridCol w:w="4808"/>
+        <w:gridCol w:w="7314"/>
       </w:tblGrid>
       <w:tr>
         <w:trPr>
@@ -622,7 +630,7 @@
         </w:trPr>
         <w:tc>
           <w:tcPr>
-            <w:tcW w:type="dxa" w:w="4959"/>
+            <w:tcW w:type="dxa" w:w="1558"/>
             <w:vAlign w:val="center"/>
             <w:tcMar>
               <w:top w:w="80" w:type="dxa"/>
@@ -650,7 +658,7 @@
         </w:tc>
         <w:tc>
           <w:tcPr>
-            <w:tcW w:type="dxa" w:w="4959"/>
+            <w:tcW w:type="dxa" w:w="4808"/>
             <w:vAlign w:val="center"/>
             <w:tcMar>
               <w:top w:w="80" w:type="dxa"/>
@@ -678,7 +686,7 @@
         </w:tc>
         <w:tc>
           <w:tcPr>
-            <w:tcW w:type="dxa" w:w="4959"/>
+            <w:tcW w:type="dxa" w:w="7314"/>
             <w:vAlign w:val="center"/>
             <w:tcMar>
               <w:top w:w="80" w:type="dxa"/>
@@ -706,9 +714,10 @@
         </w:tc>
       </w:tr>
       <w:tr>
+        <w:trPr/>
         <w:tc>
           <w:tcPr>
-            <w:tcW w:type="dxa" w:w="1656"/>
+            <w:tcW w:type="dxa" w:w="1558"/>
             <w:vAlign w:val="center"/>
             <w:tcMar>
               <w:top w:w="80" w:type="dxa"/>
@@ -735,7 +744,7 @@
         </w:tc>
         <w:tc>
           <w:tcPr>
-            <w:tcW w:type="dxa" w:w="5112"/>
+            <w:tcW w:type="dxa" w:w="4808"/>
             <w:vAlign w:val="center"/>
             <w:tcMar>
               <w:top w:w="80" w:type="dxa"/>
@@ -762,7 +771,7 @@
         </w:tc>
         <w:tc>
           <w:tcPr>
-            <w:tcW w:type="dxa" w:w="7776"/>
+            <w:tcW w:type="dxa" w:w="7314"/>
             <w:vAlign w:val="center"/>
             <w:tcMar>
               <w:top w:w="80" w:type="dxa"/>
@@ -789,9 +798,10 @@
         </w:tc>
       </w:tr>
       <w:tr>
+        <w:trPr/>
         <w:tc>
           <w:tcPr>
-            <w:tcW w:type="dxa" w:w="1656"/>
+            <w:tcW w:type="dxa" w:w="1558"/>
             <w:vAlign w:val="center"/>
             <w:tcMar>
               <w:top w:w="80" w:type="dxa"/>
@@ -819,7 +829,7 @@
         </w:tc>
         <w:tc>
           <w:tcPr>
-            <w:tcW w:type="dxa" w:w="5112"/>
+            <w:tcW w:type="dxa" w:w="4808"/>
             <w:vAlign w:val="center"/>
             <w:tcMar>
               <w:top w:w="80" w:type="dxa"/>
@@ -847,7 +857,7 @@
         </w:tc>
         <w:tc>
           <w:tcPr>
-            <w:tcW w:type="dxa" w:w="7776"/>
+            <w:tcW w:type="dxa" w:w="7314"/>
             <w:vAlign w:val="center"/>
             <w:tcMar>
               <w:top w:w="80" w:type="dxa"/>
@@ -875,9 +885,10 @@
         </w:tc>
       </w:tr>
       <w:tr>
+        <w:trPr/>
         <w:tc>
           <w:tcPr>
-            <w:tcW w:type="dxa" w:w="1656"/>
+            <w:tcW w:type="dxa" w:w="1558"/>
             <w:vAlign w:val="center"/>
             <w:tcMar>
               <w:top w:w="80" w:type="dxa"/>
@@ -904,7 +915,7 @@
         </w:tc>
         <w:tc>
           <w:tcPr>
-            <w:tcW w:type="dxa" w:w="5112"/>
+            <w:tcW w:type="dxa" w:w="4808"/>
             <w:vAlign w:val="center"/>
             <w:tcMar>
               <w:top w:w="80" w:type="dxa"/>
@@ -931,7 +942,7 @@
         </w:tc>
         <w:tc>
           <w:tcPr>
-            <w:tcW w:type="dxa" w:w="7776"/>
+            <w:tcW w:type="dxa" w:w="7314"/>
             <w:vAlign w:val="center"/>
             <w:tcMar>
               <w:top w:w="80" w:type="dxa"/>
@@ -958,9 +969,10 @@
         </w:tc>
       </w:tr>
       <w:tr>
+        <w:trPr/>
         <w:tc>
           <w:tcPr>
-            <w:tcW w:type="dxa" w:w="1656"/>
+            <w:tcW w:type="dxa" w:w="1558"/>
             <w:vAlign w:val="center"/>
             <w:tcMar>
               <w:top w:w="80" w:type="dxa"/>
@@ -988,7 +1000,7 @@
         </w:tc>
         <w:tc>
           <w:tcPr>
-            <w:tcW w:type="dxa" w:w="5112"/>
+            <w:tcW w:type="dxa" w:w="4808"/>
             <w:vAlign w:val="center"/>
             <w:tcMar>
               <w:top w:w="80" w:type="dxa"/>
@@ -1016,7 +1028,7 @@
         </w:tc>
         <w:tc>
           <w:tcPr>
-            <w:tcW w:type="dxa" w:w="7776"/>
+            <w:tcW w:type="dxa" w:w="7314"/>
             <w:vAlign w:val="center"/>
             <w:tcMar>
               <w:top w:w="80" w:type="dxa"/>
@@ -1044,9 +1056,10 @@
         </w:tc>
       </w:tr>
       <w:tr>
+        <w:trPr/>
         <w:tc>
           <w:tcPr>
-            <w:tcW w:type="dxa" w:w="1656"/>
+            <w:tcW w:type="dxa" w:w="1558"/>
             <w:vAlign w:val="center"/>
             <w:tcMar>
               <w:top w:w="80" w:type="dxa"/>
@@ -1073,7 +1086,7 @@
         </w:tc>
         <w:tc>
           <w:tcPr>
-            <w:tcW w:type="dxa" w:w="5112"/>
+            <w:tcW w:type="dxa" w:w="4808"/>
             <w:vAlign w:val="center"/>
             <w:tcMar>
               <w:top w:w="80" w:type="dxa"/>
@@ -1100,7 +1113,7 @@
         </w:tc>
         <w:tc>
           <w:tcPr>
-            <w:tcW w:type="dxa" w:w="7776"/>
+            <w:tcW w:type="dxa" w:w="7314"/>
             <w:vAlign w:val="center"/>
             <w:tcMar>
               <w:top w:w="80" w:type="dxa"/>
@@ -1127,9 +1140,10 @@
         </w:tc>
       </w:tr>
       <w:tr>
+        <w:trPr/>
         <w:tc>
           <w:tcPr>
-            <w:tcW w:type="dxa" w:w="1656"/>
+            <w:tcW w:type="dxa" w:w="1558"/>
             <w:vAlign w:val="center"/>
             <w:tcMar>
               <w:top w:w="80" w:type="dxa"/>
@@ -1157,7 +1171,7 @@
         </w:tc>
         <w:tc>
           <w:tcPr>
-            <w:tcW w:type="dxa" w:w="5112"/>
+            <w:tcW w:type="dxa" w:w="4808"/>
             <w:vAlign w:val="center"/>
             <w:tcMar>
               <w:top w:w="80" w:type="dxa"/>
@@ -1185,7 +1199,7 @@
         </w:tc>
         <w:tc>
           <w:tcPr>
-            <w:tcW w:type="dxa" w:w="7776"/>
+            <w:tcW w:type="dxa" w:w="7314"/>
             <w:vAlign w:val="center"/>
             <w:tcMar>
               <w:top w:w="80" w:type="dxa"/>
@@ -1213,9 +1227,10 @@
         </w:tc>
       </w:tr>
       <w:tr>
+        <w:trPr/>
         <w:tc>
           <w:tcPr>
-            <w:tcW w:type="dxa" w:w="1656"/>
+            <w:tcW w:type="dxa" w:w="1558"/>
             <w:vAlign w:val="center"/>
             <w:tcMar>
               <w:top w:w="80" w:type="dxa"/>
@@ -1242,7 +1257,7 @@
         </w:tc>
         <w:tc>
           <w:tcPr>
-            <w:tcW w:type="dxa" w:w="5112"/>
+            <w:tcW w:type="dxa" w:w="4808"/>
             <w:vAlign w:val="center"/>
             <w:tcMar>
               <w:top w:w="80" w:type="dxa"/>
@@ -1269,7 +1284,7 @@
         </w:tc>
         <w:tc>
           <w:tcPr>
-            <w:tcW w:type="dxa" w:w="7776"/>
+            <w:tcW w:type="dxa" w:w="7314"/>
             <w:vAlign w:val="center"/>
             <w:tcMar>
               <w:top w:w="80" w:type="dxa"/>
@@ -1296,9 +1311,10 @@
         </w:tc>
       </w:tr>
       <w:tr>
+        <w:trPr/>
         <w:tc>
           <w:tcPr>
-            <w:tcW w:type="dxa" w:w="1656"/>
+            <w:tcW w:type="dxa" w:w="1558"/>
             <w:vAlign w:val="center"/>
             <w:tcMar>
               <w:top w:w="80" w:type="dxa"/>
@@ -1326,7 +1342,7 @@
         </w:tc>
         <w:tc>
           <w:tcPr>
-            <w:tcW w:type="dxa" w:w="5112"/>
+            <w:tcW w:type="dxa" w:w="4808"/>
             <w:vAlign w:val="center"/>
             <w:tcMar>
               <w:top w:w="80" w:type="dxa"/>
@@ -1354,7 +1370,7 @@
         </w:tc>
         <w:tc>
           <w:tcPr>
-            <w:tcW w:type="dxa" w:w="7776"/>
+            <w:tcW w:type="dxa" w:w="7314"/>
             <w:vAlign w:val="center"/>
             <w:tcMar>
               <w:top w:w="80" w:type="dxa"/>
@@ -1403,17 +1419,18 @@
     </w:p>
     <w:tbl>
       <w:tblPr>
-        <w:tblW w:type="auto" w:w="0"/>
-        <w:jc w:val="center"/>
+        <w:tblW w:type="dxa" w:w="13680"/>
         <w:tblLayout w:type="fixed"/>
         <w:tblLook w:firstColumn="1" w:firstRow="1" w:lastColumn="0" w:lastRow="0" w:noHBand="0" w:noVBand="1" w:val="04A0"/>
+        <w:jc w:val="center"/>
+        <w:tblInd w:type="dxa" w:w="120"/>
       </w:tblPr>
       <w:tblGrid>
-        <w:gridCol w:w="792"/>
-        <w:gridCol w:w="2736"/>
-        <w:gridCol w:w="4968"/>
-        <w:gridCol w:w="5112"/>
-        <w:gridCol w:w="1944"/>
+        <w:gridCol w:w="697"/>
+        <w:gridCol w:w="2407"/>
+        <w:gridCol w:w="4370"/>
+        <w:gridCol w:w="4497"/>
+        <w:gridCol w:w="1709"/>
       </w:tblGrid>
       <w:tr>
         <w:trPr>
@@ -1421,7 +1438,7 @@
         </w:trPr>
         <w:tc>
           <w:tcPr>
-            <w:tcW w:type="dxa" w:w="2975"/>
+            <w:tcW w:type="dxa" w:w="697"/>
             <w:vAlign w:val="center"/>
             <w:tcMar>
               <w:top w:w="80" w:type="dxa"/>
@@ -1449,7 +1466,7 @@
         </w:tc>
         <w:tc>
           <w:tcPr>
-            <w:tcW w:type="dxa" w:w="2975"/>
+            <w:tcW w:type="dxa" w:w="2407"/>
             <w:vAlign w:val="center"/>
             <w:tcMar>
               <w:top w:w="80" w:type="dxa"/>
@@ -1477,7 +1494,7 @@
         </w:tc>
         <w:tc>
           <w:tcPr>
-            <w:tcW w:type="dxa" w:w="2975"/>
+            <w:tcW w:type="dxa" w:w="4370"/>
             <w:vAlign w:val="center"/>
             <w:tcMar>
               <w:top w:w="80" w:type="dxa"/>
@@ -1505,7 +1522,7 @@
         </w:tc>
         <w:tc>
           <w:tcPr>
-            <w:tcW w:type="dxa" w:w="2975"/>
+            <w:tcW w:type="dxa" w:w="4497"/>
             <w:vAlign w:val="center"/>
             <w:tcMar>
               <w:top w:w="80" w:type="dxa"/>
@@ -1533,7 +1550,7 @@
         </w:tc>
         <w:tc>
           <w:tcPr>
-            <w:tcW w:type="dxa" w:w="2975"/>
+            <w:tcW w:type="dxa" w:w="1709"/>
             <w:vAlign w:val="center"/>
             <w:tcMar>
               <w:top w:w="80" w:type="dxa"/>
@@ -1561,9 +1578,10 @@
         </w:tc>
       </w:tr>
       <w:tr>
+        <w:trPr/>
         <w:tc>
           <w:tcPr>
-            <w:tcW w:type="dxa" w:w="792"/>
+            <w:tcW w:type="dxa" w:w="697"/>
             <w:vAlign w:val="center"/>
             <w:tcMar>
               <w:top w:w="80" w:type="dxa"/>
@@ -1590,7 +1608,7 @@
         </w:tc>
         <w:tc>
           <w:tcPr>
-            <w:tcW w:type="dxa" w:w="2736"/>
+            <w:tcW w:type="dxa" w:w="2407"/>
             <w:vAlign w:val="center"/>
             <w:tcMar>
               <w:top w:w="80" w:type="dxa"/>
@@ -1617,7 +1635,7 @@
         </w:tc>
         <w:tc>
           <w:tcPr>
-            <w:tcW w:type="dxa" w:w="4968"/>
+            <w:tcW w:type="dxa" w:w="4370"/>
             <w:vAlign w:val="center"/>
             <w:tcMar>
               <w:top w:w="80" w:type="dxa"/>
@@ -1644,7 +1662,7 @@
         </w:tc>
         <w:tc>
           <w:tcPr>
-            <w:tcW w:type="dxa" w:w="5112"/>
+            <w:tcW w:type="dxa" w:w="4497"/>
             <w:vAlign w:val="center"/>
             <w:tcMar>
               <w:top w:w="80" w:type="dxa"/>
@@ -1671,7 +1689,7 @@
         </w:tc>
         <w:tc>
           <w:tcPr>
-            <w:tcW w:type="dxa" w:w="1944"/>
+            <w:tcW w:type="dxa" w:w="1709"/>
             <w:vAlign w:val="center"/>
             <w:tcMar>
               <w:top w:w="80" w:type="dxa"/>
@@ -1698,9 +1716,10 @@
         </w:tc>
       </w:tr>
       <w:tr>
+        <w:trPr/>
         <w:tc>
           <w:tcPr>
-            <w:tcW w:type="dxa" w:w="792"/>
+            <w:tcW w:type="dxa" w:w="697"/>
             <w:vAlign w:val="center"/>
             <w:tcMar>
               <w:top w:w="80" w:type="dxa"/>
@@ -1728,7 +1747,7 @@
         </w:tc>
         <w:tc>
           <w:tcPr>
-            <w:tcW w:type="dxa" w:w="2736"/>
+            <w:tcW w:type="dxa" w:w="2407"/>
             <w:vAlign w:val="center"/>
             <w:tcMar>
               <w:top w:w="80" w:type="dxa"/>
@@ -1756,7 +1775,7 @@
         </w:tc>
         <w:tc>
           <w:tcPr>
-            <w:tcW w:type="dxa" w:w="4968"/>
+            <w:tcW w:type="dxa" w:w="4370"/>
             <w:vAlign w:val="center"/>
             <w:tcMar>
               <w:top w:w="80" w:type="dxa"/>
@@ -1784,7 +1803,7 @@
         </w:tc>
         <w:tc>
           <w:tcPr>
-            <w:tcW w:type="dxa" w:w="5112"/>
+            <w:tcW w:type="dxa" w:w="4497"/>
             <w:vAlign w:val="center"/>
             <w:tcMar>
               <w:top w:w="80" w:type="dxa"/>
@@ -1812,7 +1831,7 @@
         </w:tc>
         <w:tc>
           <w:tcPr>
-            <w:tcW w:type="dxa" w:w="1944"/>
+            <w:tcW w:type="dxa" w:w="1709"/>
             <w:vAlign w:val="center"/>
             <w:tcMar>
               <w:top w:w="80" w:type="dxa"/>
@@ -1840,9 +1859,10 @@
         </w:tc>
       </w:tr>
       <w:tr>
+        <w:trPr/>
         <w:tc>
           <w:tcPr>
-            <w:tcW w:type="dxa" w:w="792"/>
+            <w:tcW w:type="dxa" w:w="697"/>
             <w:vAlign w:val="center"/>
             <w:tcMar>
               <w:top w:w="80" w:type="dxa"/>
@@ -1869,7 +1889,7 @@
         </w:tc>
         <w:tc>
           <w:tcPr>
-            <w:tcW w:type="dxa" w:w="2736"/>
+            <w:tcW w:type="dxa" w:w="2407"/>
             <w:vAlign w:val="center"/>
             <w:tcMar>
               <w:top w:w="80" w:type="dxa"/>
@@ -1896,7 +1916,7 @@
         </w:tc>
         <w:tc>
           <w:tcPr>
-            <w:tcW w:type="dxa" w:w="4968"/>
+            <w:tcW w:type="dxa" w:w="4370"/>
             <w:vAlign w:val="center"/>
             <w:tcMar>
               <w:top w:w="80" w:type="dxa"/>
@@ -1923,7 +1943,7 @@
         </w:tc>
         <w:tc>
           <w:tcPr>
-            <w:tcW w:type="dxa" w:w="5112"/>
+            <w:tcW w:type="dxa" w:w="4497"/>
             <w:vAlign w:val="center"/>
             <w:tcMar>
               <w:top w:w="80" w:type="dxa"/>
@@ -1950,7 +1970,7 @@
         </w:tc>
         <w:tc>
           <w:tcPr>
-            <w:tcW w:type="dxa" w:w="1944"/>
+            <w:tcW w:type="dxa" w:w="1709"/>
             <w:vAlign w:val="center"/>
             <w:tcMar>
               <w:top w:w="80" w:type="dxa"/>
@@ -1977,9 +1997,10 @@
         </w:tc>
       </w:tr>
       <w:tr>
+        <w:trPr/>
         <w:tc>
           <w:tcPr>
-            <w:tcW w:type="dxa" w:w="792"/>
+            <w:tcW w:type="dxa" w:w="697"/>
             <w:vAlign w:val="center"/>
             <w:tcMar>
               <w:top w:w="80" w:type="dxa"/>
@@ -2007,7 +2028,7 @@
         </w:tc>
         <w:tc>
           <w:tcPr>
-            <w:tcW w:type="dxa" w:w="2736"/>
+            <w:tcW w:type="dxa" w:w="2407"/>
             <w:vAlign w:val="center"/>
             <w:tcMar>
               <w:top w:w="80" w:type="dxa"/>
@@ -2035,7 +2056,7 @@
         </w:tc>
         <w:tc>
           <w:tcPr>
-            <w:tcW w:type="dxa" w:w="4968"/>
+            <w:tcW w:type="dxa" w:w="4370"/>
             <w:vAlign w:val="center"/>
             <w:tcMar>
               <w:top w:w="80" w:type="dxa"/>
@@ -2063,7 +2084,7 @@
         </w:tc>
         <w:tc>
           <w:tcPr>
-            <w:tcW w:type="dxa" w:w="5112"/>
+            <w:tcW w:type="dxa" w:w="4497"/>
             <w:vAlign w:val="center"/>
             <w:tcMar>
               <w:top w:w="80" w:type="dxa"/>
@@ -2091,7 +2112,7 @@
         </w:tc>
         <w:tc>
           <w:tcPr>
-            <w:tcW w:type="dxa" w:w="1944"/>
+            <w:tcW w:type="dxa" w:w="1709"/>
             <w:vAlign w:val="center"/>
             <w:tcMar>
               <w:top w:w="80" w:type="dxa"/>
@@ -2119,9 +2140,10 @@
         </w:tc>
       </w:tr>
       <w:tr>
+        <w:trPr/>
         <w:tc>
           <w:tcPr>
-            <w:tcW w:type="dxa" w:w="792"/>
+            <w:tcW w:type="dxa" w:w="697"/>
             <w:vAlign w:val="center"/>
             <w:tcMar>
               <w:top w:w="80" w:type="dxa"/>
@@ -2148,7 +2170,7 @@
         </w:tc>
         <w:tc>
           <w:tcPr>
-            <w:tcW w:type="dxa" w:w="2736"/>
+            <w:tcW w:type="dxa" w:w="2407"/>
             <w:vAlign w:val="center"/>
             <w:tcMar>
               <w:top w:w="80" w:type="dxa"/>
@@ -2175,7 +2197,7 @@
         </w:tc>
         <w:tc>
           <w:tcPr>
-            <w:tcW w:type="dxa" w:w="4968"/>
+            <w:tcW w:type="dxa" w:w="4370"/>
             <w:vAlign w:val="center"/>
             <w:tcMar>
               <w:top w:w="80" w:type="dxa"/>
@@ -2202,7 +2224,7 @@
         </w:tc>
         <w:tc>
           <w:tcPr>
-            <w:tcW w:type="dxa" w:w="5112"/>
+            <w:tcW w:type="dxa" w:w="4497"/>
             <w:vAlign w:val="center"/>
             <w:tcMar>
               <w:top w:w="80" w:type="dxa"/>
@@ -2229,7 +2251,7 @@
         </w:tc>
         <w:tc>
           <w:tcPr>
-            <w:tcW w:type="dxa" w:w="1944"/>
+            <w:tcW w:type="dxa" w:w="1709"/>
             <w:vAlign w:val="center"/>
             <w:tcMar>
               <w:top w:w="80" w:type="dxa"/>
@@ -2256,9 +2278,10 @@
         </w:tc>
       </w:tr>
       <w:tr>
+        <w:trPr/>
         <w:tc>
           <w:tcPr>
-            <w:tcW w:type="dxa" w:w="792"/>
+            <w:tcW w:type="dxa" w:w="697"/>
             <w:vAlign w:val="center"/>
             <w:tcMar>
               <w:top w:w="80" w:type="dxa"/>
@@ -2286,7 +2309,7 @@
         </w:tc>
         <w:tc>
           <w:tcPr>
-            <w:tcW w:type="dxa" w:w="2736"/>
+            <w:tcW w:type="dxa" w:w="2407"/>
             <w:vAlign w:val="center"/>
             <w:tcMar>
               <w:top w:w="80" w:type="dxa"/>
@@ -2314,7 +2337,7 @@
         </w:tc>
         <w:tc>
           <w:tcPr>
-            <w:tcW w:type="dxa" w:w="4968"/>
+            <w:tcW w:type="dxa" w:w="4370"/>
             <w:vAlign w:val="center"/>
             <w:tcMar>
               <w:top w:w="80" w:type="dxa"/>
@@ -2342,7 +2365,7 @@
         </w:tc>
         <w:tc>
           <w:tcPr>
-            <w:tcW w:type="dxa" w:w="5112"/>
+            <w:tcW w:type="dxa" w:w="4497"/>
             <w:vAlign w:val="center"/>
             <w:tcMar>
               <w:top w:w="80" w:type="dxa"/>
@@ -2370,7 +2393,7 @@
         </w:tc>
         <w:tc>
           <w:tcPr>
-            <w:tcW w:type="dxa" w:w="1944"/>
+            <w:tcW w:type="dxa" w:w="1709"/>
             <w:vAlign w:val="center"/>
             <w:tcMar>
               <w:top w:w="80" w:type="dxa"/>
@@ -2398,9 +2421,10 @@
         </w:tc>
       </w:tr>
       <w:tr>
+        <w:trPr/>
         <w:tc>
           <w:tcPr>
-            <w:tcW w:type="dxa" w:w="792"/>
+            <w:tcW w:type="dxa" w:w="697"/>
             <w:vAlign w:val="center"/>
             <w:tcMar>
               <w:top w:w="80" w:type="dxa"/>
@@ -2427,7 +2451,7 @@
         </w:tc>
         <w:tc>
           <w:tcPr>
-            <w:tcW w:type="dxa" w:w="2736"/>
+            <w:tcW w:type="dxa" w:w="2407"/>
             <w:vAlign w:val="center"/>
             <w:tcMar>
               <w:top w:w="80" w:type="dxa"/>
@@ -2454,7 +2478,7 @@
         </w:tc>
         <w:tc>
           <w:tcPr>
-            <w:tcW w:type="dxa" w:w="4968"/>
+            <w:tcW w:type="dxa" w:w="4370"/>
             <w:vAlign w:val="center"/>
             <w:tcMar>
               <w:top w:w="80" w:type="dxa"/>
@@ -2481,7 +2505,7 @@
         </w:tc>
         <w:tc>
           <w:tcPr>
-            <w:tcW w:type="dxa" w:w="5112"/>
+            <w:tcW w:type="dxa" w:w="4497"/>
             <w:vAlign w:val="center"/>
             <w:tcMar>
               <w:top w:w="80" w:type="dxa"/>
@@ -2508,7 +2532,7 @@
         </w:tc>
         <w:tc>
           <w:tcPr>
-            <w:tcW w:type="dxa" w:w="1944"/>
+            <w:tcW w:type="dxa" w:w="1709"/>
             <w:vAlign w:val="center"/>
             <w:tcMar>
               <w:top w:w="80" w:type="dxa"/>
@@ -2535,9 +2559,10 @@
         </w:tc>
       </w:tr>
       <w:tr>
+        <w:trPr/>
         <w:tc>
           <w:tcPr>
-            <w:tcW w:type="dxa" w:w="792"/>
+            <w:tcW w:type="dxa" w:w="697"/>
             <w:vAlign w:val="center"/>
             <w:tcMar>
               <w:top w:w="80" w:type="dxa"/>
@@ -2565,7 +2590,7 @@
         </w:tc>
         <w:tc>
           <w:tcPr>
-            <w:tcW w:type="dxa" w:w="2736"/>
+            <w:tcW w:type="dxa" w:w="2407"/>
             <w:vAlign w:val="center"/>
             <w:tcMar>
               <w:top w:w="80" w:type="dxa"/>
@@ -2593,7 +2618,7 @@
         </w:tc>
         <w:tc>
           <w:tcPr>
-            <w:tcW w:type="dxa" w:w="4968"/>
+            <w:tcW w:type="dxa" w:w="4370"/>
             <w:vAlign w:val="center"/>
             <w:tcMar>
               <w:top w:w="80" w:type="dxa"/>
@@ -2621,7 +2646,7 @@
         </w:tc>
         <w:tc>
           <w:tcPr>
-            <w:tcW w:type="dxa" w:w="5112"/>
+            <w:tcW w:type="dxa" w:w="4497"/>
             <w:vAlign w:val="center"/>
             <w:tcMar>
               <w:top w:w="80" w:type="dxa"/>
@@ -2649,7 +2674,7 @@
         </w:tc>
         <w:tc>
           <w:tcPr>
-            <w:tcW w:type="dxa" w:w="1944"/>
+            <w:tcW w:type="dxa" w:w="1709"/>
             <w:vAlign w:val="center"/>
             <w:tcMar>
               <w:top w:w="80" w:type="dxa"/>
@@ -2677,9 +2702,10 @@
         </w:tc>
       </w:tr>
       <w:tr>
+        <w:trPr/>
         <w:tc>
           <w:tcPr>
-            <w:tcW w:type="dxa" w:w="792"/>
+            <w:tcW w:type="dxa" w:w="697"/>
             <w:vAlign w:val="center"/>
             <w:tcMar>
               <w:top w:w="80" w:type="dxa"/>
@@ -2706,7 +2732,7 @@
         </w:tc>
         <w:tc>
           <w:tcPr>
-            <w:tcW w:type="dxa" w:w="2736"/>
+            <w:tcW w:type="dxa" w:w="2407"/>
             <w:vAlign w:val="center"/>
             <w:tcMar>
               <w:top w:w="80" w:type="dxa"/>
@@ -2733,7 +2759,7 @@
         </w:tc>
         <w:tc>
           <w:tcPr>
-            <w:tcW w:type="dxa" w:w="4968"/>
+            <w:tcW w:type="dxa" w:w="4370"/>
             <w:vAlign w:val="center"/>
             <w:tcMar>
               <w:top w:w="80" w:type="dxa"/>
@@ -2760,7 +2786,7 @@
         </w:tc>
         <w:tc>
           <w:tcPr>
-            <w:tcW w:type="dxa" w:w="5112"/>
+            <w:tcW w:type="dxa" w:w="4497"/>
             <w:vAlign w:val="center"/>
             <w:tcMar>
               <w:top w:w="80" w:type="dxa"/>
@@ -2787,7 +2813,7 @@
         </w:tc>
         <w:tc>
           <w:tcPr>
-            <w:tcW w:type="dxa" w:w="1944"/>
+            <w:tcW w:type="dxa" w:w="1709"/>
             <w:vAlign w:val="center"/>
             <w:tcMar>
               <w:top w:w="80" w:type="dxa"/>
@@ -2814,9 +2840,10 @@
         </w:tc>
       </w:tr>
       <w:tr>
+        <w:trPr/>
         <w:tc>
           <w:tcPr>
-            <w:tcW w:type="dxa" w:w="792"/>
+            <w:tcW w:type="dxa" w:w="697"/>
             <w:vAlign w:val="center"/>
             <w:tcMar>
               <w:top w:w="80" w:type="dxa"/>
@@ -2844,7 +2871,7 @@
         </w:tc>
         <w:tc>
           <w:tcPr>
-            <w:tcW w:type="dxa" w:w="2736"/>
+            <w:tcW w:type="dxa" w:w="2407"/>
             <w:vAlign w:val="center"/>
             <w:tcMar>
               <w:top w:w="80" w:type="dxa"/>
@@ -2872,7 +2899,7 @@
         </w:tc>
         <w:tc>
           <w:tcPr>
-            <w:tcW w:type="dxa" w:w="4968"/>
+            <w:tcW w:type="dxa" w:w="4370"/>
             <w:vAlign w:val="center"/>
             <w:tcMar>
               <w:top w:w="80" w:type="dxa"/>
@@ -2900,7 +2927,7 @@
         </w:tc>
         <w:tc>
           <w:tcPr>
-            <w:tcW w:type="dxa" w:w="5112"/>
+            <w:tcW w:type="dxa" w:w="4497"/>
             <w:vAlign w:val="center"/>
             <w:tcMar>
               <w:top w:w="80" w:type="dxa"/>
@@ -2928,7 +2955,7 @@
         </w:tc>
         <w:tc>
           <w:tcPr>
-            <w:tcW w:type="dxa" w:w="1944"/>
+            <w:tcW w:type="dxa" w:w="1709"/>
             <w:vAlign w:val="center"/>
             <w:tcMar>
               <w:top w:w="80" w:type="dxa"/>
@@ -2980,16 +3007,17 @@
     </w:p>
     <w:tbl>
       <w:tblPr>
-        <w:tblW w:type="auto" w:w="0"/>
-        <w:jc w:val="center"/>
+        <w:tblW w:type="dxa" w:w="13680"/>
         <w:tblLayout w:type="fixed"/>
         <w:tblLook w:firstColumn="1" w:firstRow="1" w:lastColumn="0" w:lastRow="0" w:noHBand="0" w:noVBand="1" w:val="04A0"/>
+        <w:jc w:val="center"/>
+        <w:tblInd w:type="dxa" w:w="120"/>
       </w:tblPr>
       <w:tblGrid>
-        <w:gridCol w:w="3240"/>
-        <w:gridCol w:w="4896"/>
-        <w:gridCol w:w="3384"/>
-        <w:gridCol w:w="3816"/>
+        <w:gridCol w:w="2890"/>
+        <w:gridCol w:w="4367"/>
+        <w:gridCol w:w="3019"/>
+        <w:gridCol w:w="3404"/>
       </w:tblGrid>
       <w:tr>
         <w:trPr>
@@ -2997,7 +3025,7 @@
         </w:trPr>
         <w:tc>
           <w:tcPr>
-            <w:tcW w:type="dxa" w:w="3719"/>
+            <w:tcW w:type="dxa" w:w="2890"/>
             <w:vAlign w:val="center"/>
             <w:tcMar>
               <w:top w:w="80" w:type="dxa"/>
@@ -3025,7 +3053,7 @@
         </w:tc>
         <w:tc>
           <w:tcPr>
-            <w:tcW w:type="dxa" w:w="3719"/>
+            <w:tcW w:type="dxa" w:w="4367"/>
             <w:vAlign w:val="center"/>
             <w:tcMar>
               <w:top w:w="80" w:type="dxa"/>
@@ -3053,7 +3081,7 @@
         </w:tc>
         <w:tc>
           <w:tcPr>
-            <w:tcW w:type="dxa" w:w="3719"/>
+            <w:tcW w:type="dxa" w:w="3019"/>
             <w:vAlign w:val="center"/>
             <w:tcMar>
               <w:top w:w="80" w:type="dxa"/>
@@ -3081,7 +3109,7 @@
         </w:tc>
         <w:tc>
           <w:tcPr>
-            <w:tcW w:type="dxa" w:w="3719"/>
+            <w:tcW w:type="dxa" w:w="3404"/>
             <w:vAlign w:val="center"/>
             <w:tcMar>
               <w:top w:w="80" w:type="dxa"/>
@@ -3109,9 +3137,10 @@
         </w:tc>
       </w:tr>
       <w:tr>
+        <w:trPr/>
         <w:tc>
           <w:tcPr>
-            <w:tcW w:type="dxa" w:w="3240"/>
+            <w:tcW w:type="dxa" w:w="2890"/>
             <w:vAlign w:val="center"/>
             <w:tcMar>
               <w:top w:w="80" w:type="dxa"/>
@@ -3138,7 +3167,7 @@
         </w:tc>
         <w:tc>
           <w:tcPr>
-            <w:tcW w:type="dxa" w:w="4896"/>
+            <w:tcW w:type="dxa" w:w="4367"/>
             <w:vAlign w:val="center"/>
             <w:tcMar>
               <w:top w:w="80" w:type="dxa"/>
@@ -3165,7 +3194,7 @@
         </w:tc>
         <w:tc>
           <w:tcPr>
-            <w:tcW w:type="dxa" w:w="3384"/>
+            <w:tcW w:type="dxa" w:w="3019"/>
             <w:vAlign w:val="center"/>
             <w:tcMar>
               <w:top w:w="80" w:type="dxa"/>
@@ -3192,7 +3221,7 @@
         </w:tc>
         <w:tc>
           <w:tcPr>
-            <w:tcW w:type="dxa" w:w="3816"/>
+            <w:tcW w:type="dxa" w:w="3404"/>
             <w:vAlign w:val="center"/>
             <w:tcMar>
               <w:top w:w="80" w:type="dxa"/>
@@ -3230,16 +3259,17 @@
     </w:p>
     <w:tbl>
       <w:tblPr>
-        <w:tblW w:type="auto" w:w="0"/>
-        <w:jc w:val="center"/>
+        <w:tblW w:type="dxa" w:w="13680"/>
         <w:tblLayout w:type="fixed"/>
         <w:tblLook w:firstColumn="1" w:firstRow="1" w:lastColumn="0" w:lastRow="0" w:noHBand="0" w:noVBand="1" w:val="04A0"/>
+        <w:jc w:val="center"/>
+        <w:tblInd w:type="dxa" w:w="120"/>
       </w:tblPr>
       <w:tblGrid>
-        <w:gridCol w:w="3240"/>
-        <w:gridCol w:w="4896"/>
-        <w:gridCol w:w="3384"/>
-        <w:gridCol w:w="3816"/>
+        <w:gridCol w:w="2890"/>
+        <w:gridCol w:w="4367"/>
+        <w:gridCol w:w="3019"/>
+        <w:gridCol w:w="3404"/>
       </w:tblGrid>
       <w:tr>
         <w:trPr>
@@ -3247,7 +3277,7 @@
         </w:trPr>
         <w:tc>
           <w:tcPr>
-            <w:tcW w:type="dxa" w:w="3719"/>
+            <w:tcW w:type="dxa" w:w="2890"/>
             <w:vAlign w:val="center"/>
             <w:tcMar>
               <w:top w:w="80" w:type="dxa"/>
@@ -3275,7 +3305,7 @@
         </w:tc>
         <w:tc>
           <w:tcPr>
-            <w:tcW w:type="dxa" w:w="3719"/>
+            <w:tcW w:type="dxa" w:w="4367"/>
             <w:vAlign w:val="center"/>
             <w:tcMar>
               <w:top w:w="80" w:type="dxa"/>
@@ -3303,7 +3333,7 @@
         </w:tc>
         <w:tc>
           <w:tcPr>
-            <w:tcW w:type="dxa" w:w="3719"/>
+            <w:tcW w:type="dxa" w:w="3019"/>
             <w:vAlign w:val="center"/>
             <w:tcMar>
               <w:top w:w="80" w:type="dxa"/>
@@ -3331,7 +3361,7 @@
         </w:tc>
         <w:tc>
           <w:tcPr>
-            <w:tcW w:type="dxa" w:w="3719"/>
+            <w:tcW w:type="dxa" w:w="3404"/>
             <w:vAlign w:val="center"/>
             <w:tcMar>
               <w:top w:w="80" w:type="dxa"/>
@@ -3359,9 +3389,10 @@
         </w:tc>
       </w:tr>
       <w:tr>
+        <w:trPr/>
         <w:tc>
           <w:tcPr>
-            <w:tcW w:type="dxa" w:w="3240"/>
+            <w:tcW w:type="dxa" w:w="2890"/>
             <w:vAlign w:val="center"/>
             <w:tcMar>
               <w:top w:w="80" w:type="dxa"/>
@@ -3388,7 +3419,7 @@
         </w:tc>
         <w:tc>
           <w:tcPr>
-            <w:tcW w:type="dxa" w:w="4896"/>
+            <w:tcW w:type="dxa" w:w="4367"/>
             <w:vAlign w:val="center"/>
             <w:tcMar>
               <w:top w:w="80" w:type="dxa"/>
@@ -3415,7 +3446,7 @@
         </w:tc>
         <w:tc>
           <w:tcPr>
-            <w:tcW w:type="dxa" w:w="3384"/>
+            <w:tcW w:type="dxa" w:w="3019"/>
             <w:vAlign w:val="center"/>
             <w:tcMar>
               <w:top w:w="80" w:type="dxa"/>
@@ -3442,7 +3473,7 @@
         </w:tc>
         <w:tc>
           <w:tcPr>
-            <w:tcW w:type="dxa" w:w="3816"/>
+            <w:tcW w:type="dxa" w:w="3404"/>
             <w:vAlign w:val="center"/>
             <w:tcMar>
               <w:top w:w="80" w:type="dxa"/>
@@ -3480,16 +3511,17 @@
     </w:p>
     <w:tbl>
       <w:tblPr>
-        <w:tblW w:type="auto" w:w="0"/>
-        <w:jc w:val="center"/>
+        <w:tblW w:type="dxa" w:w="13680"/>
         <w:tblLayout w:type="fixed"/>
         <w:tblLook w:firstColumn="1" w:firstRow="1" w:lastColumn="0" w:lastRow="0" w:noHBand="0" w:noVBand="1" w:val="04A0"/>
+        <w:jc w:val="center"/>
+        <w:tblInd w:type="dxa" w:w="120"/>
       </w:tblPr>
       <w:tblGrid>
-        <w:gridCol w:w="3240"/>
-        <w:gridCol w:w="4896"/>
-        <w:gridCol w:w="3384"/>
-        <w:gridCol w:w="3816"/>
+        <w:gridCol w:w="2890"/>
+        <w:gridCol w:w="4367"/>
+        <w:gridCol w:w="3019"/>
+        <w:gridCol w:w="3404"/>
       </w:tblGrid>
       <w:tr>
         <w:trPr>
@@ -3497,7 +3529,7 @@
         </w:trPr>
         <w:tc>
           <w:tcPr>
-            <w:tcW w:type="dxa" w:w="3719"/>
+            <w:tcW w:type="dxa" w:w="2890"/>
             <w:vAlign w:val="center"/>
             <w:tcMar>
               <w:top w:w="80" w:type="dxa"/>
@@ -3525,7 +3557,7 @@
         </w:tc>
         <w:tc>
           <w:tcPr>
-            <w:tcW w:type="dxa" w:w="3719"/>
+            <w:tcW w:type="dxa" w:w="4367"/>
             <w:vAlign w:val="center"/>
             <w:tcMar>
               <w:top w:w="80" w:type="dxa"/>
@@ -3553,7 +3585,7 @@
         </w:tc>
         <w:tc>
           <w:tcPr>
-            <w:tcW w:type="dxa" w:w="3719"/>
+            <w:tcW w:type="dxa" w:w="3019"/>
             <w:vAlign w:val="center"/>
             <w:tcMar>
               <w:top w:w="80" w:type="dxa"/>
@@ -3581,7 +3613,7 @@
         </w:tc>
         <w:tc>
           <w:tcPr>
-            <w:tcW w:type="dxa" w:w="3719"/>
+            <w:tcW w:type="dxa" w:w="3404"/>
             <w:vAlign w:val="center"/>
             <w:tcMar>
               <w:top w:w="80" w:type="dxa"/>
@@ -3609,9 +3641,10 @@
         </w:tc>
       </w:tr>
       <w:tr>
+        <w:trPr/>
         <w:tc>
           <w:tcPr>
-            <w:tcW w:type="dxa" w:w="3240"/>
+            <w:tcW w:type="dxa" w:w="2890"/>
             <w:vAlign w:val="center"/>
             <w:tcMar>
               <w:top w:w="80" w:type="dxa"/>
@@ -3638,7 +3671,7 @@
         </w:tc>
         <w:tc>
           <w:tcPr>
-            <w:tcW w:type="dxa" w:w="4896"/>
+            <w:tcW w:type="dxa" w:w="4367"/>
             <w:vAlign w:val="center"/>
             <w:tcMar>
               <w:top w:w="80" w:type="dxa"/>
@@ -3665,7 +3698,7 @@
         </w:tc>
         <w:tc>
           <w:tcPr>
-            <w:tcW w:type="dxa" w:w="3384"/>
+            <w:tcW w:type="dxa" w:w="3019"/>
             <w:vAlign w:val="center"/>
             <w:tcMar>
               <w:top w:w="80" w:type="dxa"/>
@@ -3692,7 +3725,7 @@
         </w:tc>
         <w:tc>
           <w:tcPr>
-            <w:tcW w:type="dxa" w:w="3816"/>
+            <w:tcW w:type="dxa" w:w="3404"/>
             <w:vAlign w:val="center"/>
             <w:tcMar>
               <w:top w:w="80" w:type="dxa"/>
@@ -3730,16 +3763,17 @@
     </w:p>
     <w:tbl>
       <w:tblPr>
-        <w:tblW w:type="auto" w:w="0"/>
-        <w:jc w:val="center"/>
+        <w:tblW w:type="dxa" w:w="13680"/>
         <w:tblLayout w:type="fixed"/>
         <w:tblLook w:firstColumn="1" w:firstRow="1" w:lastColumn="0" w:lastRow="0" w:noHBand="0" w:noVBand="1" w:val="04A0"/>
+        <w:jc w:val="center"/>
+        <w:tblInd w:type="dxa" w:w="120"/>
       </w:tblPr>
       <w:tblGrid>
-        <w:gridCol w:w="3240"/>
-        <w:gridCol w:w="4896"/>
-        <w:gridCol w:w="3384"/>
-        <w:gridCol w:w="3816"/>
+        <w:gridCol w:w="2890"/>
+        <w:gridCol w:w="4367"/>
+        <w:gridCol w:w="3019"/>
+        <w:gridCol w:w="3404"/>
       </w:tblGrid>
       <w:tr>
         <w:trPr>
@@ -3747,7 +3781,7 @@
         </w:trPr>
         <w:tc>
           <w:tcPr>
-            <w:tcW w:type="dxa" w:w="3719"/>
+            <w:tcW w:type="dxa" w:w="2890"/>
             <w:vAlign w:val="center"/>
             <w:tcMar>
               <w:top w:w="80" w:type="dxa"/>
@@ -3775,7 +3809,7 @@
         </w:tc>
         <w:tc>
           <w:tcPr>
-            <w:tcW w:type="dxa" w:w="3719"/>
+            <w:tcW w:type="dxa" w:w="4367"/>
             <w:vAlign w:val="center"/>
             <w:tcMar>
               <w:top w:w="80" w:type="dxa"/>
@@ -3803,7 +3837,7 @@
         </w:tc>
         <w:tc>
           <w:tcPr>
-            <w:tcW w:type="dxa" w:w="3719"/>
+            <w:tcW w:type="dxa" w:w="3019"/>
             <w:vAlign w:val="center"/>
             <w:tcMar>
               <w:top w:w="80" w:type="dxa"/>
@@ -3831,7 +3865,7 @@
         </w:tc>
         <w:tc>
           <w:tcPr>
-            <w:tcW w:type="dxa" w:w="3719"/>
+            <w:tcW w:type="dxa" w:w="3404"/>
             <w:vAlign w:val="center"/>
             <w:tcMar>
               <w:top w:w="80" w:type="dxa"/>
@@ -3859,9 +3893,10 @@
         </w:tc>
       </w:tr>
       <w:tr>
+        <w:trPr/>
         <w:tc>
           <w:tcPr>
-            <w:tcW w:type="dxa" w:w="3240"/>
+            <w:tcW w:type="dxa" w:w="2890"/>
             <w:vAlign w:val="center"/>
             <w:tcMar>
               <w:top w:w="80" w:type="dxa"/>
@@ -3888,7 +3923,7 @@
         </w:tc>
         <w:tc>
           <w:tcPr>
-            <w:tcW w:type="dxa" w:w="4896"/>
+            <w:tcW w:type="dxa" w:w="4367"/>
             <w:vAlign w:val="center"/>
             <w:tcMar>
               <w:top w:w="80" w:type="dxa"/>
@@ -3915,7 +3950,7 @@
         </w:tc>
         <w:tc>
           <w:tcPr>
-            <w:tcW w:type="dxa" w:w="3384"/>
+            <w:tcW w:type="dxa" w:w="3019"/>
             <w:vAlign w:val="center"/>
             <w:tcMar>
               <w:top w:w="80" w:type="dxa"/>
@@ -3942,7 +3977,7 @@
         </w:tc>
         <w:tc>
           <w:tcPr>
-            <w:tcW w:type="dxa" w:w="3816"/>
+            <w:tcW w:type="dxa" w:w="3404"/>
             <w:vAlign w:val="center"/>
             <w:tcMar>
               <w:top w:w="80" w:type="dxa"/>
@@ -3980,16 +4015,17 @@
     </w:p>
     <w:tbl>
       <w:tblPr>
-        <w:tblW w:type="auto" w:w="0"/>
-        <w:jc w:val="center"/>
+        <w:tblW w:type="dxa" w:w="13680"/>
         <w:tblLayout w:type="fixed"/>
         <w:tblLook w:firstColumn="1" w:firstRow="1" w:lastColumn="0" w:lastRow="0" w:noHBand="0" w:noVBand="1" w:val="04A0"/>
+        <w:jc w:val="center"/>
+        <w:tblInd w:type="dxa" w:w="120"/>
       </w:tblPr>
       <w:tblGrid>
-        <w:gridCol w:w="3240"/>
-        <w:gridCol w:w="4896"/>
-        <w:gridCol w:w="3384"/>
-        <w:gridCol w:w="3816"/>
+        <w:gridCol w:w="2890"/>
+        <w:gridCol w:w="4367"/>
+        <w:gridCol w:w="3019"/>
+        <w:gridCol w:w="3404"/>
       </w:tblGrid>
       <w:tr>
         <w:trPr>
@@ -3997,7 +4033,7 @@
         </w:trPr>
         <w:tc>
           <w:tcPr>
-            <w:tcW w:type="dxa" w:w="3719"/>
+            <w:tcW w:type="dxa" w:w="2890"/>
             <w:vAlign w:val="center"/>
             <w:tcMar>
               <w:top w:w="80" w:type="dxa"/>
@@ -4025,7 +4061,7 @@
         </w:tc>
         <w:tc>
           <w:tcPr>
-            <w:tcW w:type="dxa" w:w="3719"/>
+            <w:tcW w:type="dxa" w:w="4367"/>
             <w:vAlign w:val="center"/>
             <w:tcMar>
               <w:top w:w="80" w:type="dxa"/>
@@ -4053,7 +4089,7 @@
         </w:tc>
         <w:tc>
           <w:tcPr>
-            <w:tcW w:type="dxa" w:w="3719"/>
+            <w:tcW w:type="dxa" w:w="3019"/>
             <w:vAlign w:val="center"/>
             <w:tcMar>
               <w:top w:w="80" w:type="dxa"/>
@@ -4081,7 +4117,7 @@
         </w:tc>
         <w:tc>
           <w:tcPr>
-            <w:tcW w:type="dxa" w:w="3719"/>
+            <w:tcW w:type="dxa" w:w="3404"/>
             <w:vAlign w:val="center"/>
             <w:tcMar>
               <w:top w:w="80" w:type="dxa"/>
@@ -4109,9 +4145,10 @@
         </w:tc>
       </w:tr>
       <w:tr>
+        <w:trPr/>
         <w:tc>
           <w:tcPr>
-            <w:tcW w:type="dxa" w:w="3240"/>
+            <w:tcW w:type="dxa" w:w="2890"/>
             <w:vAlign w:val="center"/>
             <w:tcMar>
               <w:top w:w="80" w:type="dxa"/>
@@ -4138,7 +4175,7 @@
         </w:tc>
         <w:tc>
           <w:tcPr>
-            <w:tcW w:type="dxa" w:w="4896"/>
+            <w:tcW w:type="dxa" w:w="4367"/>
             <w:vAlign w:val="center"/>
             <w:tcMar>
               <w:top w:w="80" w:type="dxa"/>
@@ -4165,7 +4202,7 @@
         </w:tc>
         <w:tc>
           <w:tcPr>
-            <w:tcW w:type="dxa" w:w="3384"/>
+            <w:tcW w:type="dxa" w:w="3019"/>
             <w:vAlign w:val="center"/>
             <w:tcMar>
               <w:top w:w="80" w:type="dxa"/>
@@ -4192,7 +4229,7 @@
         </w:tc>
         <w:tc>
           <w:tcPr>
-            <w:tcW w:type="dxa" w:w="3816"/>
+            <w:tcW w:type="dxa" w:w="3404"/>
             <w:vAlign w:val="center"/>
             <w:tcMar>
               <w:top w:w="80" w:type="dxa"/>
@@ -4230,16 +4267,17 @@
     </w:p>
     <w:tbl>
       <w:tblPr>
-        <w:tblW w:type="auto" w:w="0"/>
-        <w:jc w:val="center"/>
+        <w:tblW w:type="dxa" w:w="13680"/>
         <w:tblLayout w:type="fixed"/>
         <w:tblLook w:firstColumn="1" w:firstRow="1" w:lastColumn="0" w:lastRow="0" w:noHBand="0" w:noVBand="1" w:val="04A0"/>
+        <w:jc w:val="center"/>
+        <w:tblInd w:type="dxa" w:w="120"/>
       </w:tblPr>
       <w:tblGrid>
-        <w:gridCol w:w="3240"/>
-        <w:gridCol w:w="4896"/>
-        <w:gridCol w:w="3384"/>
-        <w:gridCol w:w="3816"/>
+        <w:gridCol w:w="2890"/>
+        <w:gridCol w:w="4367"/>
+        <w:gridCol w:w="3019"/>
+        <w:gridCol w:w="3404"/>
       </w:tblGrid>
       <w:tr>
         <w:trPr>
@@ -4247,7 +4285,7 @@
         </w:trPr>
         <w:tc>
           <w:tcPr>
-            <w:tcW w:type="dxa" w:w="3719"/>
+            <w:tcW w:type="dxa" w:w="2890"/>
             <w:vAlign w:val="center"/>
             <w:tcMar>
               <w:top w:w="80" w:type="dxa"/>
@@ -4275,7 +4313,7 @@
         </w:tc>
         <w:tc>
           <w:tcPr>
-            <w:tcW w:type="dxa" w:w="3719"/>
+            <w:tcW w:type="dxa" w:w="4367"/>
             <w:vAlign w:val="center"/>
             <w:tcMar>
               <w:top w:w="80" w:type="dxa"/>
@@ -4303,7 +4341,7 @@
         </w:tc>
         <w:tc>
           <w:tcPr>
-            <w:tcW w:type="dxa" w:w="3719"/>
+            <w:tcW w:type="dxa" w:w="3019"/>
             <w:vAlign w:val="center"/>
             <w:tcMar>
               <w:top w:w="80" w:type="dxa"/>
@@ -4331,7 +4369,7 @@
         </w:tc>
         <w:tc>
           <w:tcPr>
-            <w:tcW w:type="dxa" w:w="3719"/>
+            <w:tcW w:type="dxa" w:w="3404"/>
             <w:vAlign w:val="center"/>
             <w:tcMar>
               <w:top w:w="80" w:type="dxa"/>
@@ -4359,9 +4397,10 @@
         </w:tc>
       </w:tr>
       <w:tr>
+        <w:trPr/>
         <w:tc>
           <w:tcPr>
-            <w:tcW w:type="dxa" w:w="3240"/>
+            <w:tcW w:type="dxa" w:w="2890"/>
             <w:vAlign w:val="center"/>
             <w:tcMar>
               <w:top w:w="80" w:type="dxa"/>
@@ -4388,7 +4427,7 @@
         </w:tc>
         <w:tc>
           <w:tcPr>
-            <w:tcW w:type="dxa" w:w="4896"/>
+            <w:tcW w:type="dxa" w:w="4367"/>
             <w:vAlign w:val="center"/>
             <w:tcMar>
               <w:top w:w="80" w:type="dxa"/>
@@ -4415,7 +4454,7 @@
         </w:tc>
         <w:tc>
           <w:tcPr>
-            <w:tcW w:type="dxa" w:w="3384"/>
+            <w:tcW w:type="dxa" w:w="3019"/>
             <w:vAlign w:val="center"/>
             <w:tcMar>
               <w:top w:w="80" w:type="dxa"/>
@@ -4442,7 +4481,7 @@
         </w:tc>
         <w:tc>
           <w:tcPr>
-            <w:tcW w:type="dxa" w:w="3816"/>
+            <w:tcW w:type="dxa" w:w="3404"/>
             <w:vAlign w:val="center"/>
             <w:tcMar>
               <w:top w:w="80" w:type="dxa"/>
@@ -4480,16 +4519,17 @@
     </w:p>
     <w:tbl>
       <w:tblPr>
-        <w:tblW w:type="auto" w:w="0"/>
-        <w:jc w:val="center"/>
+        <w:tblW w:type="dxa" w:w="13680"/>
         <w:tblLayout w:type="fixed"/>
         <w:tblLook w:firstColumn="1" w:firstRow="1" w:lastColumn="0" w:lastRow="0" w:noHBand="0" w:noVBand="1" w:val="04A0"/>
+        <w:jc w:val="center"/>
+        <w:tblInd w:type="dxa" w:w="120"/>
       </w:tblPr>
       <w:tblGrid>
-        <w:gridCol w:w="3240"/>
-        <w:gridCol w:w="4896"/>
-        <w:gridCol w:w="3384"/>
-        <w:gridCol w:w="3816"/>
+        <w:gridCol w:w="2890"/>
+        <w:gridCol w:w="4367"/>
+        <w:gridCol w:w="3019"/>
+        <w:gridCol w:w="3404"/>
       </w:tblGrid>
       <w:tr>
         <w:trPr>
@@ -4497,7 +4537,7 @@
         </w:trPr>
         <w:tc>
           <w:tcPr>
-            <w:tcW w:type="dxa" w:w="3719"/>
+            <w:tcW w:type="dxa" w:w="2890"/>
             <w:vAlign w:val="center"/>
             <w:tcMar>
               <w:top w:w="80" w:type="dxa"/>
@@ -4525,7 +4565,7 @@
         </w:tc>
         <w:tc>
           <w:tcPr>
-            <w:tcW w:type="dxa" w:w="3719"/>
+            <w:tcW w:type="dxa" w:w="4367"/>
             <w:vAlign w:val="center"/>
             <w:tcMar>
               <w:top w:w="80" w:type="dxa"/>
@@ -4553,7 +4593,7 @@
         </w:tc>
         <w:tc>
           <w:tcPr>
-            <w:tcW w:type="dxa" w:w="3719"/>
+            <w:tcW w:type="dxa" w:w="3019"/>
             <w:vAlign w:val="center"/>
             <w:tcMar>
               <w:top w:w="80" w:type="dxa"/>
@@ -4581,7 +4621,7 @@
         </w:tc>
         <w:tc>
           <w:tcPr>
-            <w:tcW w:type="dxa" w:w="3719"/>
+            <w:tcW w:type="dxa" w:w="3404"/>
             <w:vAlign w:val="center"/>
             <w:tcMar>
               <w:top w:w="80" w:type="dxa"/>
@@ -4609,9 +4649,10 @@
         </w:tc>
       </w:tr>
       <w:tr>
+        <w:trPr/>
         <w:tc>
           <w:tcPr>
-            <w:tcW w:type="dxa" w:w="3240"/>
+            <w:tcW w:type="dxa" w:w="2890"/>
             <w:vAlign w:val="center"/>
             <w:tcMar>
               <w:top w:w="80" w:type="dxa"/>
@@ -4638,7 +4679,7 @@
         </w:tc>
         <w:tc>
           <w:tcPr>
-            <w:tcW w:type="dxa" w:w="4896"/>
+            <w:tcW w:type="dxa" w:w="4367"/>
             <w:vAlign w:val="center"/>
             <w:tcMar>
               <w:top w:w="80" w:type="dxa"/>
@@ -4665,7 +4706,7 @@
         </w:tc>
         <w:tc>
           <w:tcPr>
-            <w:tcW w:type="dxa" w:w="3384"/>
+            <w:tcW w:type="dxa" w:w="3019"/>
             <w:vAlign w:val="center"/>
             <w:tcMar>
               <w:top w:w="80" w:type="dxa"/>
@@ -4692,7 +4733,7 @@
         </w:tc>
         <w:tc>
           <w:tcPr>
-            <w:tcW w:type="dxa" w:w="3816"/>
+            <w:tcW w:type="dxa" w:w="3404"/>
             <w:vAlign w:val="center"/>
             <w:tcMar>
               <w:top w:w="80" w:type="dxa"/>
@@ -4730,16 +4771,17 @@
     </w:p>
     <w:tbl>
       <w:tblPr>
-        <w:tblW w:type="auto" w:w="0"/>
-        <w:jc w:val="center"/>
+        <w:tblW w:type="dxa" w:w="13680"/>
         <w:tblLayout w:type="fixed"/>
         <w:tblLook w:firstColumn="1" w:firstRow="1" w:lastColumn="0" w:lastRow="0" w:noHBand="0" w:noVBand="1" w:val="04A0"/>
+        <w:jc w:val="center"/>
+        <w:tblInd w:type="dxa" w:w="120"/>
       </w:tblPr>
       <w:tblGrid>
-        <w:gridCol w:w="3240"/>
-        <w:gridCol w:w="4896"/>
-        <w:gridCol w:w="3384"/>
-        <w:gridCol w:w="3816"/>
+        <w:gridCol w:w="2890"/>
+        <w:gridCol w:w="4367"/>
+        <w:gridCol w:w="3019"/>
+        <w:gridCol w:w="3404"/>
       </w:tblGrid>
       <w:tr>
         <w:trPr>
@@ -4747,7 +4789,7 @@
         </w:trPr>
         <w:tc>
           <w:tcPr>
-            <w:tcW w:type="dxa" w:w="3719"/>
+            <w:tcW w:type="dxa" w:w="2890"/>
             <w:vAlign w:val="center"/>
             <w:tcMar>
               <w:top w:w="80" w:type="dxa"/>
@@ -4775,7 +4817,7 @@
         </w:tc>
         <w:tc>
           <w:tcPr>
-            <w:tcW w:type="dxa" w:w="3719"/>
+            <w:tcW w:type="dxa" w:w="4367"/>
             <w:vAlign w:val="center"/>
             <w:tcMar>
               <w:top w:w="80" w:type="dxa"/>
@@ -4803,7 +4845,7 @@
         </w:tc>
         <w:tc>
           <w:tcPr>
-            <w:tcW w:type="dxa" w:w="3719"/>
+            <w:tcW w:type="dxa" w:w="3019"/>
             <w:vAlign w:val="center"/>
             <w:tcMar>
               <w:top w:w="80" w:type="dxa"/>
@@ -4831,7 +4873,7 @@
         </w:tc>
         <w:tc>
           <w:tcPr>
-            <w:tcW w:type="dxa" w:w="3719"/>
+            <w:tcW w:type="dxa" w:w="3404"/>
             <w:vAlign w:val="center"/>
             <w:tcMar>
               <w:top w:w="80" w:type="dxa"/>
@@ -4859,9 +4901,10 @@
         </w:tc>
       </w:tr>
       <w:tr>
+        <w:trPr/>
         <w:tc>
           <w:tcPr>
-            <w:tcW w:type="dxa" w:w="3240"/>
+            <w:tcW w:type="dxa" w:w="2890"/>
             <w:vAlign w:val="center"/>
             <w:tcMar>
               <w:top w:w="80" w:type="dxa"/>
@@ -4888,7 +4931,7 @@
         </w:tc>
         <w:tc>
           <w:tcPr>
-            <w:tcW w:type="dxa" w:w="4896"/>
+            <w:tcW w:type="dxa" w:w="4367"/>
             <w:vAlign w:val="center"/>
             <w:tcMar>
               <w:top w:w="80" w:type="dxa"/>
@@ -4915,7 +4958,7 @@
         </w:tc>
         <w:tc>
           <w:tcPr>
-            <w:tcW w:type="dxa" w:w="3384"/>
+            <w:tcW w:type="dxa" w:w="3019"/>
             <w:vAlign w:val="center"/>
             <w:tcMar>
               <w:top w:w="80" w:type="dxa"/>
@@ -4942,7 +4985,7 @@
         </w:tc>
         <w:tc>
           <w:tcPr>
-            <w:tcW w:type="dxa" w:w="3816"/>
+            <w:tcW w:type="dxa" w:w="3404"/>
             <w:vAlign w:val="center"/>
             <w:tcMar>
               <w:top w:w="80" w:type="dxa"/>
@@ -4980,16 +5023,17 @@
     </w:p>
     <w:tbl>
       <w:tblPr>
-        <w:tblW w:type="auto" w:w="0"/>
-        <w:jc w:val="center"/>
+        <w:tblW w:type="dxa" w:w="13680"/>
         <w:tblLayout w:type="fixed"/>
         <w:tblLook w:firstColumn="1" w:firstRow="1" w:lastColumn="0" w:lastRow="0" w:noHBand="0" w:noVBand="1" w:val="04A0"/>
+        <w:jc w:val="center"/>
+        <w:tblInd w:type="dxa" w:w="120"/>
       </w:tblPr>
       <w:tblGrid>
-        <w:gridCol w:w="3240"/>
-        <w:gridCol w:w="4896"/>
-        <w:gridCol w:w="3384"/>
-        <w:gridCol w:w="3816"/>
+        <w:gridCol w:w="2890"/>
+        <w:gridCol w:w="4367"/>
+        <w:gridCol w:w="3019"/>
+        <w:gridCol w:w="3404"/>
       </w:tblGrid>
       <w:tr>
         <w:trPr>
@@ -4997,7 +5041,7 @@
         </w:trPr>
         <w:tc>
           <w:tcPr>
-            <w:tcW w:type="dxa" w:w="3719"/>
+            <w:tcW w:type="dxa" w:w="2890"/>
             <w:vAlign w:val="center"/>
             <w:tcMar>
               <w:top w:w="80" w:type="dxa"/>
@@ -5025,7 +5069,7 @@
         </w:tc>
         <w:tc>
           <w:tcPr>
-            <w:tcW w:type="dxa" w:w="3719"/>
+            <w:tcW w:type="dxa" w:w="4367"/>
             <w:vAlign w:val="center"/>
             <w:tcMar>
               <w:top w:w="80" w:type="dxa"/>
@@ -5053,7 +5097,7 @@
         </w:tc>
         <w:tc>
           <w:tcPr>
-            <w:tcW w:type="dxa" w:w="3719"/>
+            <w:tcW w:type="dxa" w:w="3019"/>
             <w:vAlign w:val="center"/>
             <w:tcMar>
               <w:top w:w="80" w:type="dxa"/>
@@ -5081,7 +5125,7 @@
         </w:tc>
         <w:tc>
           <w:tcPr>
-            <w:tcW w:type="dxa" w:w="3719"/>
+            <w:tcW w:type="dxa" w:w="3404"/>
             <w:vAlign w:val="center"/>
             <w:tcMar>
               <w:top w:w="80" w:type="dxa"/>
@@ -5109,9 +5153,10 @@
         </w:tc>
       </w:tr>
       <w:tr>
+        <w:trPr/>
         <w:tc>
           <w:tcPr>
-            <w:tcW w:type="dxa" w:w="3240"/>
+            <w:tcW w:type="dxa" w:w="2890"/>
             <w:vAlign w:val="center"/>
             <w:tcMar>
               <w:top w:w="80" w:type="dxa"/>
@@ -5138,7 +5183,7 @@
         </w:tc>
         <w:tc>
           <w:tcPr>
-            <w:tcW w:type="dxa" w:w="4896"/>
+            <w:tcW w:type="dxa" w:w="4367"/>
             <w:vAlign w:val="center"/>
             <w:tcMar>
               <w:top w:w="80" w:type="dxa"/>
@@ -5165,7 +5210,7 @@
         </w:tc>
         <w:tc>
           <w:tcPr>
-            <w:tcW w:type="dxa" w:w="3384"/>
+            <w:tcW w:type="dxa" w:w="3019"/>
             <w:vAlign w:val="center"/>
             <w:tcMar>
               <w:top w:w="80" w:type="dxa"/>
@@ -5192,7 +5237,7 @@
         </w:tc>
         <w:tc>
           <w:tcPr>
-            <w:tcW w:type="dxa" w:w="3816"/>
+            <w:tcW w:type="dxa" w:w="3404"/>
             <w:vAlign w:val="center"/>
             <w:tcMar>
               <w:top w:w="80" w:type="dxa"/>
@@ -5230,16 +5275,17 @@
     </w:p>
     <w:tbl>
       <w:tblPr>
-        <w:tblW w:type="auto" w:w="0"/>
-        <w:jc w:val="center"/>
+        <w:tblW w:type="dxa" w:w="13680"/>
         <w:tblLayout w:type="fixed"/>
         <w:tblLook w:firstColumn="1" w:firstRow="1" w:lastColumn="0" w:lastRow="0" w:noHBand="0" w:noVBand="1" w:val="04A0"/>
+        <w:jc w:val="center"/>
+        <w:tblInd w:type="dxa" w:w="120"/>
       </w:tblPr>
       <w:tblGrid>
-        <w:gridCol w:w="3240"/>
-        <w:gridCol w:w="4896"/>
-        <w:gridCol w:w="3384"/>
-        <w:gridCol w:w="3816"/>
+        <w:gridCol w:w="2890"/>
+        <w:gridCol w:w="4367"/>
+        <w:gridCol w:w="3019"/>
+        <w:gridCol w:w="3404"/>
       </w:tblGrid>
       <w:tr>
         <w:trPr>
@@ -5247,7 +5293,7 @@
         </w:trPr>
         <w:tc>
           <w:tcPr>
-            <w:tcW w:type="dxa" w:w="3719"/>
+            <w:tcW w:type="dxa" w:w="2890"/>
             <w:vAlign w:val="center"/>
             <w:tcMar>
               <w:top w:w="80" w:type="dxa"/>
@@ -5275,7 +5321,7 @@
         </w:tc>
         <w:tc>
           <w:tcPr>
-            <w:tcW w:type="dxa" w:w="3719"/>
+            <w:tcW w:type="dxa" w:w="4367"/>
             <w:vAlign w:val="center"/>
             <w:tcMar>
               <w:top w:w="80" w:type="dxa"/>
@@ -5303,7 +5349,7 @@
         </w:tc>
         <w:tc>
           <w:tcPr>
-            <w:tcW w:type="dxa" w:w="3719"/>
+            <w:tcW w:type="dxa" w:w="3019"/>
             <w:vAlign w:val="center"/>
             <w:tcMar>
               <w:top w:w="80" w:type="dxa"/>
@@ -5331,7 +5377,7 @@
         </w:tc>
         <w:tc>
           <w:tcPr>
-            <w:tcW w:type="dxa" w:w="3719"/>
+            <w:tcW w:type="dxa" w:w="3404"/>
             <w:vAlign w:val="center"/>
             <w:tcMar>
               <w:top w:w="80" w:type="dxa"/>
@@ -5359,9 +5405,10 @@
         </w:tc>
       </w:tr>
       <w:tr>
+        <w:trPr/>
         <w:tc>
           <w:tcPr>
-            <w:tcW w:type="dxa" w:w="3240"/>
+            <w:tcW w:type="dxa" w:w="2890"/>
             <w:vAlign w:val="center"/>
             <w:tcMar>
               <w:top w:w="80" w:type="dxa"/>
@@ -5388,7 +5435,7 @@
         </w:tc>
         <w:tc>
           <w:tcPr>
-            <w:tcW w:type="dxa" w:w="4896"/>
+            <w:tcW w:type="dxa" w:w="4367"/>
             <w:vAlign w:val="center"/>
             <w:tcMar>
               <w:top w:w="80" w:type="dxa"/>
@@ -5415,7 +5462,7 @@
         </w:tc>
         <w:tc>
           <w:tcPr>
-            <w:tcW w:type="dxa" w:w="3384"/>
+            <w:tcW w:type="dxa" w:w="3019"/>
             <w:vAlign w:val="center"/>
             <w:tcMar>
               <w:top w:w="80" w:type="dxa"/>
@@ -5442,7 +5489,7 @@
         </w:tc>
         <w:tc>
           <w:tcPr>
-            <w:tcW w:type="dxa" w:w="3816"/>
+            <w:tcW w:type="dxa" w:w="3404"/>
             <w:vAlign w:val="center"/>
             <w:tcMar>
               <w:top w:w="80" w:type="dxa"/>
@@ -5471,11 +5518,6 @@
     </w:tbl>
     <w:p/>
     <w:p>
-      <w:r>
-        <w:br w:type="page"/>
-      </w:r>
-    </w:p>
-    <w:p>
       <w:pPr>
         <w:pStyle w:val="Heading1"/>
       </w:pPr>
@@ -5490,15 +5532,16 @@
     </w:p>
     <w:tbl>
       <w:tblPr>
-        <w:tblW w:type="auto" w:w="0"/>
-        <w:jc w:val="center"/>
+        <w:tblW w:type="dxa" w:w="13680"/>
         <w:tblLayout w:type="fixed"/>
         <w:tblLook w:firstColumn="1" w:firstRow="1" w:lastColumn="0" w:lastRow="0" w:noHBand="0" w:noVBand="1" w:val="04A0"/>
+        <w:jc w:val="center"/>
+        <w:tblInd w:type="dxa" w:w="120"/>
       </w:tblPr>
       <w:tblGrid>
-        <w:gridCol w:w="2448"/>
-        <w:gridCol w:w="6480"/>
-        <w:gridCol w:w="6408"/>
+        <w:gridCol w:w="2184"/>
+        <w:gridCol w:w="5780"/>
+        <w:gridCol w:w="5716"/>
       </w:tblGrid>
       <w:tr>
         <w:trPr>
@@ -5506,7 +5549,7 @@
         </w:trPr>
         <w:tc>
           <w:tcPr>
-            <w:tcW w:type="dxa" w:w="4959"/>
+            <w:tcW w:type="dxa" w:w="2184"/>
             <w:vAlign w:val="center"/>
             <w:tcMar>
               <w:top w:w="80" w:type="dxa"/>
@@ -5534,7 +5577,7 @@
         </w:tc>
         <w:tc>
           <w:tcPr>
-            <w:tcW w:type="dxa" w:w="4959"/>
+            <w:tcW w:type="dxa" w:w="5780"/>
             <w:vAlign w:val="center"/>
             <w:tcMar>
               <w:top w:w="80" w:type="dxa"/>
@@ -5562,7 +5605,7 @@
         </w:tc>
         <w:tc>
           <w:tcPr>
-            <w:tcW w:type="dxa" w:w="4959"/>
+            <w:tcW w:type="dxa" w:w="5716"/>
             <w:vAlign w:val="center"/>
             <w:tcMar>
               <w:top w:w="80" w:type="dxa"/>
@@ -5590,9 +5633,10 @@
         </w:tc>
       </w:tr>
       <w:tr>
+        <w:trPr/>
         <w:tc>
           <w:tcPr>
-            <w:tcW w:type="dxa" w:w="2448"/>
+            <w:tcW w:type="dxa" w:w="2184"/>
             <w:vAlign w:val="center"/>
             <w:tcMar>
               <w:top w:w="80" w:type="dxa"/>
@@ -5619,7 +5663,7 @@
         </w:tc>
         <w:tc>
           <w:tcPr>
-            <w:tcW w:type="dxa" w:w="6480"/>
+            <w:tcW w:type="dxa" w:w="5780"/>
             <w:vAlign w:val="center"/>
             <w:tcMar>
               <w:top w:w="80" w:type="dxa"/>
@@ -5646,7 +5690,7 @@
         </w:tc>
         <w:tc>
           <w:tcPr>
-            <w:tcW w:type="dxa" w:w="6408"/>
+            <w:tcW w:type="dxa" w:w="5716"/>
             <w:vAlign w:val="center"/>
             <w:tcMar>
               <w:top w:w="80" w:type="dxa"/>
@@ -5673,9 +5717,10 @@
         </w:tc>
       </w:tr>
       <w:tr>
+        <w:trPr/>
         <w:tc>
           <w:tcPr>
-            <w:tcW w:type="dxa" w:w="2448"/>
+            <w:tcW w:type="dxa" w:w="2184"/>
             <w:vAlign w:val="center"/>
             <w:tcMar>
               <w:top w:w="80" w:type="dxa"/>
@@ -5703,7 +5748,7 @@
         </w:tc>
         <w:tc>
           <w:tcPr>
-            <w:tcW w:type="dxa" w:w="6480"/>
+            <w:tcW w:type="dxa" w:w="5780"/>
             <w:vAlign w:val="center"/>
             <w:tcMar>
               <w:top w:w="80" w:type="dxa"/>
@@ -5731,7 +5776,7 @@
         </w:tc>
         <w:tc>
           <w:tcPr>
-            <w:tcW w:type="dxa" w:w="6408"/>
+            <w:tcW w:type="dxa" w:w="5716"/>
             <w:vAlign w:val="center"/>
             <w:tcMar>
               <w:top w:w="80" w:type="dxa"/>
@@ -5759,9 +5804,10 @@
         </w:tc>
       </w:tr>
       <w:tr>
+        <w:trPr/>
         <w:tc>
           <w:tcPr>
-            <w:tcW w:type="dxa" w:w="2448"/>
+            <w:tcW w:type="dxa" w:w="2184"/>
             <w:vAlign w:val="center"/>
             <w:tcMar>
               <w:top w:w="80" w:type="dxa"/>
@@ -5788,7 +5834,7 @@
         </w:tc>
         <w:tc>
           <w:tcPr>
-            <w:tcW w:type="dxa" w:w="6480"/>
+            <w:tcW w:type="dxa" w:w="5780"/>
             <w:vAlign w:val="center"/>
             <w:tcMar>
               <w:top w:w="80" w:type="dxa"/>
@@ -5815,7 +5861,7 @@
         </w:tc>
         <w:tc>
           <w:tcPr>
-            <w:tcW w:type="dxa" w:w="6408"/>
+            <w:tcW w:type="dxa" w:w="5716"/>
             <w:vAlign w:val="center"/>
             <w:tcMar>
               <w:top w:w="80" w:type="dxa"/>
@@ -5842,9 +5888,10 @@
         </w:tc>
       </w:tr>
       <w:tr>
+        <w:trPr/>
         <w:tc>
           <w:tcPr>
-            <w:tcW w:type="dxa" w:w="2448"/>
+            <w:tcW w:type="dxa" w:w="2184"/>
             <w:vAlign w:val="center"/>
             <w:tcMar>
               <w:top w:w="80" w:type="dxa"/>
@@ -5872,7 +5919,7 @@
         </w:tc>
         <w:tc>
           <w:tcPr>
-            <w:tcW w:type="dxa" w:w="6480"/>
+            <w:tcW w:type="dxa" w:w="5780"/>
             <w:vAlign w:val="center"/>
             <w:tcMar>
               <w:top w:w="80" w:type="dxa"/>
@@ -5900,7 +5947,7 @@
         </w:tc>
         <w:tc>
           <w:tcPr>
-            <w:tcW w:type="dxa" w:w="6408"/>
+            <w:tcW w:type="dxa" w:w="5716"/>
             <w:vAlign w:val="center"/>
             <w:tcMar>
               <w:top w:w="80" w:type="dxa"/>
@@ -5928,9 +5975,10 @@
         </w:tc>
       </w:tr>
       <w:tr>
+        <w:trPr/>
         <w:tc>
           <w:tcPr>
-            <w:tcW w:type="dxa" w:w="2448"/>
+            <w:tcW w:type="dxa" w:w="2184"/>
             <w:vAlign w:val="center"/>
             <w:tcMar>
               <w:top w:w="80" w:type="dxa"/>
@@ -5957,7 +6005,7 @@
         </w:tc>
         <w:tc>
           <w:tcPr>
-            <w:tcW w:type="dxa" w:w="6480"/>
+            <w:tcW w:type="dxa" w:w="5780"/>
             <w:vAlign w:val="center"/>
             <w:tcMar>
               <w:top w:w="80" w:type="dxa"/>
@@ -5984,7 +6032,7 @@
         </w:tc>
         <w:tc>
           <w:tcPr>
-            <w:tcW w:type="dxa" w:w="6408"/>
+            <w:tcW w:type="dxa" w:w="5716"/>
             <w:vAlign w:val="center"/>
             <w:tcMar>
               <w:top w:w="80" w:type="dxa"/>
@@ -6067,15 +6115,16 @@
     </w:p>
     <w:tbl>
       <w:tblPr>
-        <w:tblW w:type="auto" w:w="0"/>
-        <w:jc w:val="center"/>
+        <w:tblW w:type="dxa" w:w="13680"/>
         <w:tblLayout w:type="fixed"/>
         <w:tblLook w:firstColumn="1" w:firstRow="1" w:lastColumn="0" w:lastRow="0" w:noHBand="0" w:noVBand="1" w:val="04A0"/>
+        <w:jc w:val="center"/>
+        <w:tblInd w:type="dxa" w:w="120"/>
       </w:tblPr>
       <w:tblGrid>
-        <w:gridCol w:w="2304"/>
-        <w:gridCol w:w="7416"/>
-        <w:gridCol w:w="5616"/>
+        <w:gridCol w:w="2055"/>
+        <w:gridCol w:w="6615"/>
+        <w:gridCol w:w="5010"/>
       </w:tblGrid>
       <w:tr>
         <w:trPr>
@@ -6083,7 +6132,7 @@
         </w:trPr>
         <w:tc>
           <w:tcPr>
-            <w:tcW w:type="dxa" w:w="4959"/>
+            <w:tcW w:type="dxa" w:w="2055"/>
             <w:vAlign w:val="center"/>
             <w:tcMar>
               <w:top w:w="80" w:type="dxa"/>
@@ -6111,7 +6160,7 @@
         </w:tc>
         <w:tc>
           <w:tcPr>
-            <w:tcW w:type="dxa" w:w="4959"/>
+            <w:tcW w:type="dxa" w:w="6615"/>
             <w:vAlign w:val="center"/>
             <w:tcMar>
               <w:top w:w="80" w:type="dxa"/>
@@ -6139,7 +6188,7 @@
         </w:tc>
         <w:tc>
           <w:tcPr>
-            <w:tcW w:type="dxa" w:w="4959"/>
+            <w:tcW w:type="dxa" w:w="5010"/>
             <w:vAlign w:val="center"/>
             <w:tcMar>
               <w:top w:w="80" w:type="dxa"/>
@@ -6167,9 +6216,10 @@
         </w:tc>
       </w:tr>
       <w:tr>
+        <w:trPr/>
         <w:tc>
           <w:tcPr>
-            <w:tcW w:type="dxa" w:w="2304"/>
+            <w:tcW w:type="dxa" w:w="2055"/>
             <w:vAlign w:val="center"/>
             <w:tcMar>
               <w:top w:w="80" w:type="dxa"/>
@@ -6196,7 +6246,7 @@
         </w:tc>
         <w:tc>
           <w:tcPr>
-            <w:tcW w:type="dxa" w:w="7416"/>
+            <w:tcW w:type="dxa" w:w="6615"/>
             <w:vAlign w:val="center"/>
             <w:tcMar>
               <w:top w:w="80" w:type="dxa"/>
@@ -6223,7 +6273,7 @@
         </w:tc>
         <w:tc>
           <w:tcPr>
-            <w:tcW w:type="dxa" w:w="5616"/>
+            <w:tcW w:type="dxa" w:w="5010"/>
             <w:vAlign w:val="center"/>
             <w:tcMar>
               <w:top w:w="80" w:type="dxa"/>
@@ -6250,9 +6300,10 @@
         </w:tc>
       </w:tr>
       <w:tr>
+        <w:trPr/>
         <w:tc>
           <w:tcPr>
-            <w:tcW w:type="dxa" w:w="2304"/>
+            <w:tcW w:type="dxa" w:w="2055"/>
             <w:vAlign w:val="center"/>
             <w:tcMar>
               <w:top w:w="80" w:type="dxa"/>
@@ -6280,7 +6331,7 @@
         </w:tc>
         <w:tc>
           <w:tcPr>
-            <w:tcW w:type="dxa" w:w="7416"/>
+            <w:tcW w:type="dxa" w:w="6615"/>
             <w:vAlign w:val="center"/>
             <w:tcMar>
               <w:top w:w="80" w:type="dxa"/>
@@ -6308,7 +6359,7 @@
         </w:tc>
         <w:tc>
           <w:tcPr>
-            <w:tcW w:type="dxa" w:w="5616"/>
+            <w:tcW w:type="dxa" w:w="5010"/>
             <w:vAlign w:val="center"/>
             <w:tcMar>
               <w:top w:w="80" w:type="dxa"/>
@@ -6336,9 +6387,10 @@
         </w:tc>
       </w:tr>
       <w:tr>
+        <w:trPr/>
         <w:tc>
           <w:tcPr>
-            <w:tcW w:type="dxa" w:w="2304"/>
+            <w:tcW w:type="dxa" w:w="2055"/>
             <w:vAlign w:val="center"/>
             <w:tcMar>
               <w:top w:w="80" w:type="dxa"/>
@@ -6365,7 +6417,7 @@
         </w:tc>
         <w:tc>
           <w:tcPr>
-            <w:tcW w:type="dxa" w:w="7416"/>
+            <w:tcW w:type="dxa" w:w="6615"/>
             <w:vAlign w:val="center"/>
             <w:tcMar>
               <w:top w:w="80" w:type="dxa"/>
@@ -6392,7 +6444,7 @@
         </w:tc>
         <w:tc>
           <w:tcPr>
-            <w:tcW w:type="dxa" w:w="5616"/>
+            <w:tcW w:type="dxa" w:w="5010"/>
             <w:vAlign w:val="center"/>
             <w:tcMar>
               <w:top w:w="80" w:type="dxa"/>
@@ -6419,9 +6471,10 @@
         </w:tc>
       </w:tr>
       <w:tr>
+        <w:trPr/>
         <w:tc>
           <w:tcPr>
-            <w:tcW w:type="dxa" w:w="2304"/>
+            <w:tcW w:type="dxa" w:w="2055"/>
             <w:vAlign w:val="center"/>
             <w:tcMar>
               <w:top w:w="80" w:type="dxa"/>
@@ -6449,7 +6502,7 @@
         </w:tc>
         <w:tc>
           <w:tcPr>
-            <w:tcW w:type="dxa" w:w="7416"/>
+            <w:tcW w:type="dxa" w:w="6615"/>
             <w:vAlign w:val="center"/>
             <w:tcMar>
               <w:top w:w="80" w:type="dxa"/>
@@ -6477,7 +6530,7 @@
         </w:tc>
         <w:tc>
           <w:tcPr>
-            <w:tcW w:type="dxa" w:w="5616"/>
+            <w:tcW w:type="dxa" w:w="5010"/>
             <w:vAlign w:val="center"/>
             <w:tcMar>
               <w:top w:w="80" w:type="dxa"/>
@@ -6505,9 +6558,10 @@
         </w:tc>
       </w:tr>
       <w:tr>
+        <w:trPr/>
         <w:tc>
           <w:tcPr>
-            <w:tcW w:type="dxa" w:w="2304"/>
+            <w:tcW w:type="dxa" w:w="2055"/>
             <w:vAlign w:val="center"/>
             <w:tcMar>
               <w:top w:w="80" w:type="dxa"/>
@@ -6534,7 +6588,7 @@
         </w:tc>
         <w:tc>
           <w:tcPr>
-            <w:tcW w:type="dxa" w:w="7416"/>
+            <w:tcW w:type="dxa" w:w="6615"/>
             <w:vAlign w:val="center"/>
             <w:tcMar>
               <w:top w:w="80" w:type="dxa"/>
@@ -6561,7 +6615,7 @@
         </w:tc>
         <w:tc>
           <w:tcPr>
-            <w:tcW w:type="dxa" w:w="5616"/>
+            <w:tcW w:type="dxa" w:w="5010"/>
             <w:vAlign w:val="center"/>
             <w:tcMar>
               <w:top w:w="80" w:type="dxa"/>
@@ -6609,15 +6663,16 @@
     </w:p>
     <w:tbl>
       <w:tblPr>
-        <w:tblW w:type="auto" w:w="0"/>
-        <w:jc w:val="center"/>
+        <w:tblW w:type="dxa" w:w="13680"/>
         <w:tblLayout w:type="fixed"/>
         <w:tblLook w:firstColumn="1" w:firstRow="1" w:lastColumn="0" w:lastRow="0" w:noHBand="0" w:noVBand="1" w:val="04A0"/>
+        <w:jc w:val="center"/>
+        <w:tblInd w:type="dxa" w:w="120"/>
       </w:tblPr>
       <w:tblGrid>
-        <w:gridCol w:w="2232"/>
-        <w:gridCol w:w="7200"/>
-        <w:gridCol w:w="5904"/>
+        <w:gridCol w:w="1991"/>
+        <w:gridCol w:w="6423"/>
+        <w:gridCol w:w="5266"/>
       </w:tblGrid>
       <w:tr>
         <w:trPr>
@@ -6625,7 +6680,7 @@
         </w:trPr>
         <w:tc>
           <w:tcPr>
-            <w:tcW w:type="dxa" w:w="4959"/>
+            <w:tcW w:type="dxa" w:w="1991"/>
             <w:vAlign w:val="center"/>
             <w:tcMar>
               <w:top w:w="80" w:type="dxa"/>
@@ -6653,7 +6708,7 @@
         </w:tc>
         <w:tc>
           <w:tcPr>
-            <w:tcW w:type="dxa" w:w="4959"/>
+            <w:tcW w:type="dxa" w:w="6423"/>
             <w:vAlign w:val="center"/>
             <w:tcMar>
               <w:top w:w="80" w:type="dxa"/>
@@ -6681,7 +6736,7 @@
         </w:tc>
         <w:tc>
           <w:tcPr>
-            <w:tcW w:type="dxa" w:w="4959"/>
+            <w:tcW w:type="dxa" w:w="5266"/>
             <w:vAlign w:val="center"/>
             <w:tcMar>
               <w:top w:w="80" w:type="dxa"/>
@@ -6709,9 +6764,10 @@
         </w:tc>
       </w:tr>
       <w:tr>
+        <w:trPr/>
         <w:tc>
           <w:tcPr>
-            <w:tcW w:type="dxa" w:w="2232"/>
+            <w:tcW w:type="dxa" w:w="1991"/>
             <w:vAlign w:val="center"/>
             <w:tcMar>
               <w:top w:w="80" w:type="dxa"/>
@@ -6738,7 +6794,7 @@
         </w:tc>
         <w:tc>
           <w:tcPr>
-            <w:tcW w:type="dxa" w:w="7200"/>
+            <w:tcW w:type="dxa" w:w="6423"/>
             <w:vAlign w:val="center"/>
             <w:tcMar>
               <w:top w:w="80" w:type="dxa"/>
@@ -6765,7 +6821,7 @@
         </w:tc>
         <w:tc>
           <w:tcPr>
-            <w:tcW w:type="dxa" w:w="5904"/>
+            <w:tcW w:type="dxa" w:w="5266"/>
             <w:vAlign w:val="center"/>
             <w:tcMar>
               <w:top w:w="80" w:type="dxa"/>
@@ -6792,9 +6848,10 @@
         </w:tc>
       </w:tr>
       <w:tr>
+        <w:trPr/>
         <w:tc>
           <w:tcPr>
-            <w:tcW w:type="dxa" w:w="2232"/>
+            <w:tcW w:type="dxa" w:w="1991"/>
             <w:vAlign w:val="center"/>
             <w:tcMar>
               <w:top w:w="80" w:type="dxa"/>
@@ -6822,7 +6879,7 @@
         </w:tc>
         <w:tc>
           <w:tcPr>
-            <w:tcW w:type="dxa" w:w="7200"/>
+            <w:tcW w:type="dxa" w:w="6423"/>
             <w:vAlign w:val="center"/>
             <w:tcMar>
               <w:top w:w="80" w:type="dxa"/>
@@ -6850,7 +6907,7 @@
         </w:tc>
         <w:tc>
           <w:tcPr>
-            <w:tcW w:type="dxa" w:w="5904"/>
+            <w:tcW w:type="dxa" w:w="5266"/>
             <w:vAlign w:val="center"/>
             <w:tcMar>
               <w:top w:w="80" w:type="dxa"/>
@@ -6878,9 +6935,10 @@
         </w:tc>
       </w:tr>
       <w:tr>
+        <w:trPr/>
         <w:tc>
           <w:tcPr>
-            <w:tcW w:type="dxa" w:w="2232"/>
+            <w:tcW w:type="dxa" w:w="1991"/>
             <w:vAlign w:val="center"/>
             <w:tcMar>
               <w:top w:w="80" w:type="dxa"/>
@@ -6907,7 +6965,7 @@
         </w:tc>
         <w:tc>
           <w:tcPr>
-            <w:tcW w:type="dxa" w:w="7200"/>
+            <w:tcW w:type="dxa" w:w="6423"/>
             <w:vAlign w:val="center"/>
             <w:tcMar>
               <w:top w:w="80" w:type="dxa"/>
@@ -6934,7 +6992,7 @@
         </w:tc>
         <w:tc>
           <w:tcPr>
-            <w:tcW w:type="dxa" w:w="5904"/>
+            <w:tcW w:type="dxa" w:w="5266"/>
             <w:vAlign w:val="center"/>
             <w:tcMar>
               <w:top w:w="80" w:type="dxa"/>
@@ -6961,9 +7019,10 @@
         </w:tc>
       </w:tr>
       <w:tr>
+        <w:trPr/>
         <w:tc>
           <w:tcPr>
-            <w:tcW w:type="dxa" w:w="2232"/>
+            <w:tcW w:type="dxa" w:w="1991"/>
             <w:vAlign w:val="center"/>
             <w:tcMar>
               <w:top w:w="80" w:type="dxa"/>
@@ -6991,7 +7050,7 @@
         </w:tc>
         <w:tc>
           <w:tcPr>
-            <w:tcW w:type="dxa" w:w="7200"/>
+            <w:tcW w:type="dxa" w:w="6423"/>
             <w:vAlign w:val="center"/>
             <w:tcMar>
               <w:top w:w="80" w:type="dxa"/>
@@ -7019,7 +7078,7 @@
         </w:tc>
         <w:tc>
           <w:tcPr>
-            <w:tcW w:type="dxa" w:w="5904"/>
+            <w:tcW w:type="dxa" w:w="5266"/>
             <w:vAlign w:val="center"/>
             <w:tcMar>
               <w:top w:w="80" w:type="dxa"/>
@@ -7047,9 +7106,10 @@
         </w:tc>
       </w:tr>
       <w:tr>
+        <w:trPr/>
         <w:tc>
           <w:tcPr>
-            <w:tcW w:type="dxa" w:w="2232"/>
+            <w:tcW w:type="dxa" w:w="1991"/>
             <w:vAlign w:val="center"/>
             <w:tcMar>
               <w:top w:w="80" w:type="dxa"/>
@@ -7076,7 +7136,7 @@
         </w:tc>
         <w:tc>
           <w:tcPr>
-            <w:tcW w:type="dxa" w:w="7200"/>
+            <w:tcW w:type="dxa" w:w="6423"/>
             <w:vAlign w:val="center"/>
             <w:tcMar>
               <w:top w:w="80" w:type="dxa"/>
@@ -7103,7 +7163,7 @@
         </w:tc>
         <w:tc>
           <w:tcPr>
-            <w:tcW w:type="dxa" w:w="5904"/>
+            <w:tcW w:type="dxa" w:w="5266"/>
             <w:vAlign w:val="center"/>
             <w:tcMar>
               <w:top w:w="80" w:type="dxa"/>
@@ -7194,14 +7254,15 @@
     </w:p>
     <w:tbl>
       <w:tblPr>
-        <w:tblW w:type="auto" w:w="0"/>
-        <w:jc w:val="center"/>
+        <w:tblW w:type="dxa" w:w="13680"/>
         <w:tblLayout w:type="fixed"/>
         <w:tblLook w:firstColumn="1" w:firstRow="1" w:lastColumn="0" w:lastRow="0" w:noHBand="0" w:noVBand="1" w:val="04A0"/>
+        <w:jc w:val="center"/>
+        <w:tblInd w:type="dxa" w:w="120"/>
       </w:tblPr>
       <w:tblGrid>
-        <w:gridCol w:w="6120"/>
-        <w:gridCol w:w="9216"/>
+        <w:gridCol w:w="5459"/>
+        <w:gridCol w:w="8221"/>
       </w:tblGrid>
       <w:tr>
         <w:trPr>
@@ -7209,7 +7270,7 @@
         </w:trPr>
         <w:tc>
           <w:tcPr>
-            <w:tcW w:type="dxa" w:w="7438"/>
+            <w:tcW w:type="dxa" w:w="5459"/>
             <w:vAlign w:val="center"/>
             <w:tcMar>
               <w:top w:w="80" w:type="dxa"/>
@@ -7237,7 +7298,7 @@
         </w:tc>
         <w:tc>
           <w:tcPr>
-            <w:tcW w:type="dxa" w:w="7438"/>
+            <w:tcW w:type="dxa" w:w="8221"/>
             <w:vAlign w:val="center"/>
             <w:tcMar>
               <w:top w:w="80" w:type="dxa"/>
@@ -7265,9 +7326,10 @@
         </w:tc>
       </w:tr>
       <w:tr>
+        <w:trPr/>
         <w:tc>
           <w:tcPr>
-            <w:tcW w:type="dxa" w:w="6120"/>
+            <w:tcW w:type="dxa" w:w="5459"/>
             <w:vAlign w:val="center"/>
             <w:tcMar>
               <w:top w:w="80" w:type="dxa"/>
@@ -7294,7 +7356,7 @@
         </w:tc>
         <w:tc>
           <w:tcPr>
-            <w:tcW w:type="dxa" w:w="9216"/>
+            <w:tcW w:type="dxa" w:w="8221"/>
             <w:vAlign w:val="center"/>
             <w:tcMar>
               <w:top w:w="80" w:type="dxa"/>
@@ -7321,9 +7383,10 @@
         </w:tc>
       </w:tr>
       <w:tr>
+        <w:trPr/>
         <w:tc>
           <w:tcPr>
-            <w:tcW w:type="dxa" w:w="6120"/>
+            <w:tcW w:type="dxa" w:w="5459"/>
             <w:vAlign w:val="center"/>
             <w:tcMar>
               <w:top w:w="80" w:type="dxa"/>
@@ -7351,7 +7414,7 @@
         </w:tc>
         <w:tc>
           <w:tcPr>
-            <w:tcW w:type="dxa" w:w="9216"/>
+            <w:tcW w:type="dxa" w:w="8221"/>
             <w:vAlign w:val="center"/>
             <w:tcMar>
               <w:top w:w="80" w:type="dxa"/>
@@ -7379,9 +7442,10 @@
         </w:tc>
       </w:tr>
       <w:tr>
+        <w:trPr/>
         <w:tc>
           <w:tcPr>
-            <w:tcW w:type="dxa" w:w="6120"/>
+            <w:tcW w:type="dxa" w:w="5459"/>
             <w:vAlign w:val="center"/>
             <w:tcMar>
               <w:top w:w="80" w:type="dxa"/>
@@ -7408,7 +7472,7 @@
         </w:tc>
         <w:tc>
           <w:tcPr>
-            <w:tcW w:type="dxa" w:w="9216"/>
+            <w:tcW w:type="dxa" w:w="8221"/>
             <w:vAlign w:val="center"/>
             <w:tcMar>
               <w:top w:w="80" w:type="dxa"/>
@@ -7446,14 +7510,15 @@
     </w:p>
     <w:tbl>
       <w:tblPr>
-        <w:tblW w:type="auto" w:w="0"/>
-        <w:jc w:val="center"/>
+        <w:tblW w:type="dxa" w:w="13680"/>
         <w:tblLayout w:type="fixed"/>
         <w:tblLook w:firstColumn="1" w:firstRow="1" w:lastColumn="0" w:lastRow="0" w:noHBand="0" w:noVBand="1" w:val="04A0"/>
+        <w:jc w:val="center"/>
+        <w:tblInd w:type="dxa" w:w="120"/>
       </w:tblPr>
       <w:tblGrid>
-        <w:gridCol w:w="4608"/>
-        <w:gridCol w:w="10728"/>
+        <w:gridCol w:w="4110"/>
+        <w:gridCol w:w="9570"/>
       </w:tblGrid>
       <w:tr>
         <w:trPr>
@@ -7461,7 +7526,7 @@
         </w:trPr>
         <w:tc>
           <w:tcPr>
-            <w:tcW w:type="dxa" w:w="7438"/>
+            <w:tcW w:type="dxa" w:w="4110"/>
             <w:vAlign w:val="center"/>
             <w:tcMar>
               <w:top w:w="80" w:type="dxa"/>
@@ -7489,7 +7554,7 @@
         </w:tc>
         <w:tc>
           <w:tcPr>
-            <w:tcW w:type="dxa" w:w="7438"/>
+            <w:tcW w:type="dxa" w:w="9570"/>
             <w:vAlign w:val="center"/>
             <w:tcMar>
               <w:top w:w="80" w:type="dxa"/>
@@ -7517,9 +7582,10 @@
         </w:tc>
       </w:tr>
       <w:tr>
+        <w:trPr/>
         <w:tc>
           <w:tcPr>
-            <w:tcW w:type="dxa" w:w="4608"/>
+            <w:tcW w:type="dxa" w:w="4110"/>
             <w:vAlign w:val="center"/>
             <w:tcMar>
               <w:top w:w="80" w:type="dxa"/>
@@ -7546,7 +7612,7 @@
         </w:tc>
         <w:tc>
           <w:tcPr>
-            <w:tcW w:type="dxa" w:w="10728"/>
+            <w:tcW w:type="dxa" w:w="9570"/>
             <w:vAlign w:val="center"/>
             <w:tcMar>
               <w:top w:w="80" w:type="dxa"/>
@@ -7572,9 +7638,10 @@
         </w:tc>
       </w:tr>
       <w:tr>
+        <w:trPr/>
         <w:tc>
           <w:tcPr>
-            <w:tcW w:type="dxa" w:w="4608"/>
+            <w:tcW w:type="dxa" w:w="4110"/>
             <w:vAlign w:val="center"/>
             <w:tcMar>
               <w:top w:w="80" w:type="dxa"/>
@@ -7602,7 +7669,7 @@
         </w:tc>
         <w:tc>
           <w:tcPr>
-            <w:tcW w:type="dxa" w:w="10728"/>
+            <w:tcW w:type="dxa" w:w="9570"/>
             <w:vAlign w:val="center"/>
             <w:tcMar>
               <w:top w:w="80" w:type="dxa"/>
@@ -7630,9 +7697,10 @@
         </w:tc>
       </w:tr>
       <w:tr>
+        <w:trPr/>
         <w:tc>
           <w:tcPr>
-            <w:tcW w:type="dxa" w:w="4608"/>
+            <w:tcW w:type="dxa" w:w="4110"/>
             <w:vAlign w:val="center"/>
             <w:tcMar>
               <w:top w:w="80" w:type="dxa"/>
@@ -7659,7 +7727,7 @@
         </w:tc>
         <w:tc>
           <w:tcPr>
-            <w:tcW w:type="dxa" w:w="10728"/>
+            <w:tcW w:type="dxa" w:w="9570"/>
             <w:vAlign w:val="center"/>
             <w:tcMar>
               <w:top w:w="80" w:type="dxa"/>
@@ -7686,9 +7754,10 @@
         </w:tc>
       </w:tr>
       <w:tr>
+        <w:trPr/>
         <w:tc>
           <w:tcPr>
-            <w:tcW w:type="dxa" w:w="4608"/>
+            <w:tcW w:type="dxa" w:w="4110"/>
             <w:vAlign w:val="center"/>
             <w:tcMar>
               <w:top w:w="80" w:type="dxa"/>
@@ -7716,7 +7785,7 @@
         </w:tc>
         <w:tc>
           <w:tcPr>
-            <w:tcW w:type="dxa" w:w="10728"/>
+            <w:tcW w:type="dxa" w:w="9570"/>
             <w:vAlign w:val="center"/>
             <w:tcMar>
               <w:top w:w="80" w:type="dxa"/>
@@ -7744,9 +7813,10 @@
         </w:tc>
       </w:tr>
       <w:tr>
+        <w:trPr/>
         <w:tc>
           <w:tcPr>
-            <w:tcW w:type="dxa" w:w="4608"/>
+            <w:tcW w:type="dxa" w:w="4110"/>
             <w:vAlign w:val="center"/>
             <w:tcMar>
               <w:top w:w="80" w:type="dxa"/>
@@ -7773,7 +7843,7 @@
         </w:tc>
         <w:tc>
           <w:tcPr>
-            <w:tcW w:type="dxa" w:w="10728"/>
+            <w:tcW w:type="dxa" w:w="9570"/>
             <w:vAlign w:val="center"/>
             <w:tcMar>
               <w:top w:w="80" w:type="dxa"/>

</xml_diff>